<commit_message>
Changes to letters and other documents
</commit_message>
<xml_diff>
--- a/StateOfPractice/MACREM-2026/SupportingDocuments/Letter-of-Information-Consent-Form2.docx
+++ b/StateOfPractice/MACREM-2026/SupportingDocuments/Letter-of-Information-Consent-Form2.docx
@@ -865,6 +865,31 @@
         </w:rPr>
         <w:tab/>
       </w:r>
+      <w:ins w:id="1" w:author="Spencer Smith" w:date="2026-06-14T16:13:00Z" w16du:dateUtc="2026-06-14T20:13:00Z">
+        <w:r>
+          <w:rPr>
+            <w:sz w:val="20"/>
+            <w:lang w:val="en-CA"/>
+          </w:rPr>
+          <w:tab/>
+        </w:r>
+        <w:r>
+          <w:rPr>
+            <w:sz w:val="20"/>
+            <w:lang w:val="en-CA"/>
+          </w:rPr>
+          <w:tab/>
+        </w:r>
+      </w:ins>
+      <w:ins w:id="2" w:author="Spencer Smith" w:date="2026-06-14T16:14:00Z" w16du:dateUtc="2026-06-14T20:14:00Z">
+        <w:r>
+          <w:rPr>
+            <w:sz w:val="20"/>
+            <w:lang w:val="en-CA"/>
+          </w:rPr>
+          <w:t>Student Investigator</w:t>
+        </w:r>
+      </w:ins>
       <w:r>
         <w:rPr>
           <w:sz w:val="20"/>
@@ -894,6 +919,37 @@
         </w:rPr>
         <w:t>Ziyang Fang</w:t>
       </w:r>
+      <w:ins w:id="3" w:author="Spencer Smith" w:date="2026-06-14T16:14:00Z" w16du:dateUtc="2026-06-14T20:14:00Z">
+        <w:r>
+          <w:rPr>
+            <w:sz w:val="20"/>
+            <w:lang w:val="en-CA"/>
+          </w:rPr>
+          <w:tab/>
+        </w:r>
+        <w:r>
+          <w:rPr>
+            <w:sz w:val="20"/>
+            <w:lang w:val="en-CA"/>
+          </w:rPr>
+          <w:tab/>
+        </w:r>
+        <w:r>
+          <w:rPr>
+            <w:sz w:val="20"/>
+            <w:lang w:val="en-CA"/>
+          </w:rPr>
+          <w:tab/>
+        </w:r>
+        <w:r>
+          <w:rPr>
+            <w:sz w:val="20"/>
+            <w:lang w:val="en-CA"/>
+          </w:rPr>
+          <w:tab/>
+          <w:t>Christopher Schankula</w:t>
+        </w:r>
+      </w:ins>
     </w:p>
     <w:p>
       <w:r>
@@ -903,51 +959,63 @@
         </w:rPr>
         <w:t>Computing and Software Department</w:t>
       </w:r>
-      <w:r>
-        <w:rPr>
-          <w:sz w:val="20"/>
-          <w:lang w:val="en-CA"/>
-        </w:rPr>
-        <w:tab/>
-      </w:r>
-      <w:r>
-        <w:rPr>
-          <w:sz w:val="20"/>
-          <w:lang w:val="en-CA"/>
-        </w:rPr>
-        <w:tab/>
-      </w:r>
-      <w:r>
-        <w:rPr>
-          <w:sz w:val="20"/>
-          <w:lang w:val="en-CA"/>
-        </w:rPr>
-        <w:tab/>
-      </w:r>
-      <w:r>
-        <w:rPr>
-          <w:b/>
-          <w:sz w:val="20"/>
-          <w:lang w:val="en-CA"/>
-        </w:rPr>
-        <w:tab/>
-      </w:r>
-      <w:r>
-        <w:rPr>
-          <w:b/>
-          <w:sz w:val="20"/>
-          <w:lang w:val="en-CA"/>
-        </w:rPr>
-        <w:tab/>
-      </w:r>
-      <w:r>
-        <w:rPr>
-          <w:b/>
-          <w:sz w:val="20"/>
-          <w:lang w:val="en-CA"/>
-        </w:rPr>
-        <w:tab/>
-      </w:r>
+      <w:ins w:id="4" w:author="Spencer Smith" w:date="2026-06-14T16:14:00Z" w16du:dateUtc="2026-06-14T20:14:00Z">
+        <w:r>
+          <w:rPr>
+            <w:sz w:val="20"/>
+            <w:lang w:val="en-CA"/>
+          </w:rPr>
+          <w:tab/>
+          <w:t>Computing and Software Department</w:t>
+        </w:r>
+      </w:ins>
+      <w:del w:id="5" w:author="Spencer Smith" w:date="2026-06-14T16:14:00Z" w16du:dateUtc="2026-06-14T20:14:00Z">
+        <w:r>
+          <w:rPr>
+            <w:sz w:val="20"/>
+            <w:lang w:val="en-CA"/>
+          </w:rPr>
+          <w:tab/>
+        </w:r>
+        <w:r>
+          <w:rPr>
+            <w:sz w:val="20"/>
+            <w:lang w:val="en-CA"/>
+          </w:rPr>
+          <w:tab/>
+        </w:r>
+        <w:r>
+          <w:rPr>
+            <w:sz w:val="20"/>
+            <w:lang w:val="en-CA"/>
+          </w:rPr>
+          <w:tab/>
+        </w:r>
+        <w:r>
+          <w:rPr>
+            <w:b/>
+            <w:sz w:val="20"/>
+            <w:lang w:val="en-CA"/>
+          </w:rPr>
+          <w:tab/>
+        </w:r>
+        <w:r>
+          <w:rPr>
+            <w:b/>
+            <w:sz w:val="20"/>
+            <w:lang w:val="en-CA"/>
+          </w:rPr>
+          <w:tab/>
+        </w:r>
+        <w:r>
+          <w:rPr>
+            <w:b/>
+            <w:sz w:val="20"/>
+            <w:lang w:val="en-CA"/>
+          </w:rPr>
+          <w:tab/>
+        </w:r>
+      </w:del>
     </w:p>
     <w:p>
       <w:r>
@@ -986,6 +1054,15 @@
         </w:rPr>
         <w:tab/>
       </w:r>
+      <w:ins w:id="6" w:author="Spencer Smith" w:date="2026-06-14T16:14:00Z" w16du:dateUtc="2026-06-14T20:14:00Z">
+        <w:r>
+          <w:rPr>
+            <w:sz w:val="20"/>
+            <w:lang w:val="en-CA"/>
+          </w:rPr>
+          <w:t>Department of Engineering</w:t>
+        </w:r>
+      </w:ins>
     </w:p>
     <w:p>
       <w:r>
@@ -1016,6 +1093,15 @@
         </w:rPr>
         <w:tab/>
       </w:r>
+      <w:ins w:id="7" w:author="Spencer Smith" w:date="2026-06-14T16:14:00Z" w16du:dateUtc="2026-06-14T20:14:00Z">
+        <w:r>
+          <w:rPr>
+            <w:sz w:val="20"/>
+            <w:lang w:val="en-CA"/>
+          </w:rPr>
+          <w:t>McMaster University</w:t>
+        </w:r>
+      </w:ins>
     </w:p>
     <w:p>
       <w:r>
@@ -1039,6 +1125,15 @@
         </w:rPr>
         <w:tab/>
       </w:r>
+      <w:ins w:id="8" w:author="Spencer Smith" w:date="2026-06-14T16:14:00Z" w16du:dateUtc="2026-06-14T20:14:00Z">
+        <w:r>
+          <w:rPr>
+            <w:sz w:val="20"/>
+            <w:lang w:val="it-IT"/>
+          </w:rPr>
+          <w:t>Hamilton, Ontario, Canada</w:t>
+        </w:r>
+      </w:ins>
     </w:p>
     <w:p>
       <w:r>
@@ -1073,16 +1168,26 @@
         </w:rPr>
         <w:tab/>
       </w:r>
-      <w:bookmarkStart w:id="1" w:name="__DdeLink__874_9832321141"/>
-      <w:r>
-        <w:rPr>
-          <w:b/>
-          <w:sz w:val="20"/>
-          <w:lang w:val="en-CA"/>
-        </w:rPr>
-        <w:tab/>
-      </w:r>
-      <w:bookmarkEnd w:id="1"/>
+      <w:bookmarkStart w:id="9" w:name="__DdeLink__874_9832321141"/>
+      <w:r>
+        <w:rPr>
+          <w:b/>
+          <w:sz w:val="20"/>
+          <w:lang w:val="en-CA"/>
+        </w:rPr>
+        <w:tab/>
+      </w:r>
+      <w:bookmarkEnd w:id="9"/>
+      <w:ins w:id="10" w:author="Spencer Smith" w:date="2026-06-14T16:14:00Z" w16du:dateUtc="2026-06-14T20:14:00Z">
+        <w:r>
+          <w:rPr>
+            <w:b/>
+            <w:sz w:val="20"/>
+            <w:lang w:val="en-CA"/>
+          </w:rPr>
+          <w:t>(905) 525-9140</w:t>
+        </w:r>
+      </w:ins>
     </w:p>
     <w:p>
       <w:r>
@@ -1093,14 +1198,76 @@
         </w:rPr>
         <w:t xml:space="preserve">E-mail: </w:t>
       </w:r>
-      <w:r>
-        <w:rPr>
+      <w:ins w:id="11" w:author="Spencer Smith" w:date="2026-06-14T16:14:00Z" w16du:dateUtc="2026-06-14T20:14:00Z">
+        <w:r>
+          <w:rPr>
+            <w:b/>
+            <w:sz w:val="20"/>
+            <w:lang w:val="en-CA"/>
+          </w:rPr>
+          <w:fldChar w:fldCharType="begin"/>
+        </w:r>
+        <w:r>
+          <w:rPr>
+            <w:b/>
+            <w:sz w:val="20"/>
+            <w:lang w:val="en-CA"/>
+          </w:rPr>
+          <w:instrText>HYPERLINK "mailto:</w:instrText>
+        </w:r>
+      </w:ins>
+      <w:r>
+        <w:rPr>
+          <w:b/>
+          <w:sz w:val="20"/>
+          <w:lang w:val="en-CA"/>
+        </w:rPr>
+        <w:instrText>fangz58@mcmaster.ca</w:instrText>
+      </w:r>
+      <w:ins w:id="12" w:author="Spencer Smith" w:date="2026-06-14T16:14:00Z" w16du:dateUtc="2026-06-14T20:14:00Z">
+        <w:r>
+          <w:rPr>
+            <w:b/>
+            <w:sz w:val="20"/>
+            <w:lang w:val="en-CA"/>
+          </w:rPr>
+          <w:instrText>"</w:instrText>
+        </w:r>
+        <w:r>
+          <w:rPr>
+            <w:b/>
+            <w:sz w:val="20"/>
+            <w:lang w:val="en-CA"/>
+          </w:rPr>
+        </w:r>
+        <w:r>
+          <w:rPr>
+            <w:b/>
+            <w:sz w:val="20"/>
+            <w:lang w:val="en-CA"/>
+          </w:rPr>
+          <w:fldChar w:fldCharType="separate"/>
+        </w:r>
+      </w:ins>
+      <w:r>
+        <w:rPr>
+          <w:rStyle w:val="Hyperlink"/>
           <w:b/>
           <w:sz w:val="20"/>
           <w:lang w:val="en-CA"/>
         </w:rPr>
         <w:t>fangz58@mcmaster.ca</w:t>
       </w:r>
+      <w:ins w:id="13" w:author="Spencer Smith" w:date="2026-06-14T16:14:00Z" w16du:dateUtc="2026-06-14T20:14:00Z">
+        <w:r>
+          <w:rPr>
+            <w:b/>
+            <w:sz w:val="20"/>
+            <w:lang w:val="en-CA"/>
+          </w:rPr>
+          <w:fldChar w:fldCharType="end"/>
+        </w:r>
+      </w:ins>
       <w:r>
         <w:rPr>
           <w:b/>
@@ -1109,6 +1276,27 @@
         </w:rPr>
         <w:t xml:space="preserve"> </w:t>
       </w:r>
+      <w:ins w:id="14" w:author="Spencer Smith" w:date="2026-06-14T16:14:00Z" w16du:dateUtc="2026-06-14T20:14:00Z">
+        <w:r>
+          <w:rPr>
+            <w:b/>
+            <w:sz w:val="20"/>
+            <w:lang w:val="en-CA"/>
+          </w:rPr>
+          <w:tab/>
+          <w:t xml:space="preserve">E-mail: </w:t>
+        </w:r>
+      </w:ins>
+      <w:ins w:id="15" w:author="Spencer Smith" w:date="2026-06-14T16:15:00Z" w16du:dateUtc="2026-06-14T20:15:00Z">
+        <w:r>
+          <w:rPr>
+            <w:b/>
+            <w:sz w:val="20"/>
+            <w:lang w:val="en-CA"/>
+          </w:rPr>
+          <w:t>schankuc@mcmaster.ca</w:t>
+        </w:r>
+      </w:ins>
     </w:p>
     <w:p>
       <w:r>
@@ -1866,163 +2054,60 @@
     </w:p>
     <w:p>
       <w:pPr>
-        <w:rPr>
-          <w:sz w:val="20"/>
-          <w:lang w:val="en-CA"/>
-        </w:rPr>
-      </w:pPr>
-      <w:r>
-        <w:rPr>
-          <w:sz w:val="20"/>
-          <w:lang w:val="en-CA"/>
-        </w:rPr>
-        <w:t xml:space="preserve">This study has </w:t>
-      </w:r>
-      <w:r>
-        <w:rPr>
-          <w:sz w:val="20"/>
-          <w:szCs w:val="20"/>
-          <w:lang w:val="en-CA"/>
-        </w:rPr>
-        <w:t xml:space="preserve">been reviewed </w:t>
-      </w:r>
-      <w:r>
-        <w:rPr>
-          <w:sz w:val="20"/>
-          <w:lang w:val="en-CA"/>
-        </w:rPr>
-        <w:t xml:space="preserve">by the McMaster University Research Ethics Board and received ethics clearance. If you have concerns or questions about your rights as a participant or about the way the study is conducted, please contact: </w:t>
-      </w:r>
-    </w:p>
-    <w:p>
-      <w:pPr>
-        <w:rPr>
-          <w:sz w:val="20"/>
-          <w:lang w:val="en-CA"/>
-        </w:rPr>
-      </w:pPr>
-      <w:r>
-        <w:rPr>
-          <w:sz w:val="20"/>
-          <w:lang w:val="en-CA"/>
-        </w:rPr>
-        <w:tab/>
-      </w:r>
-      <w:r>
-        <w:rPr>
-          <w:sz w:val="20"/>
-          <w:lang w:val="en-CA"/>
-        </w:rPr>
-        <w:tab/>
-      </w:r>
-      <w:r>
-        <w:rPr>
-          <w:sz w:val="20"/>
-          <w:lang w:val="en-CA"/>
-        </w:rPr>
-        <w:tab/>
-        <w:t>McMaster Research Ethics Secretariat</w:t>
-      </w:r>
-    </w:p>
-    <w:p>
-      <w:pPr>
-        <w:rPr>
-          <w:sz w:val="20"/>
-          <w:lang w:val="en-CA"/>
-        </w:rPr>
-      </w:pPr>
-      <w:r>
-        <w:rPr>
-          <w:sz w:val="20"/>
-          <w:lang w:val="en-CA"/>
-        </w:rPr>
-        <w:tab/>
-      </w:r>
-      <w:r>
-        <w:rPr>
-          <w:sz w:val="20"/>
-          <w:lang w:val="en-CA"/>
-        </w:rPr>
-        <w:tab/>
-      </w:r>
-      <w:r>
-        <w:rPr>
-          <w:sz w:val="20"/>
-          <w:lang w:val="en-CA"/>
-        </w:rPr>
-        <w:tab/>
-        <w:t>Telephone: (905) 525-9140 ext. 23142</w:t>
-      </w:r>
-    </w:p>
-    <w:p>
-      <w:pPr>
-        <w:rPr>
-          <w:sz w:val="20"/>
-          <w:lang w:val="en-CA"/>
-        </w:rPr>
-      </w:pPr>
-      <w:r>
-        <w:rPr>
-          <w:sz w:val="20"/>
-          <w:lang w:val="en-CA"/>
-        </w:rPr>
-        <w:tab/>
-      </w:r>
-      <w:r>
-        <w:rPr>
-          <w:sz w:val="20"/>
-          <w:lang w:val="en-CA"/>
-        </w:rPr>
-        <w:tab/>
-      </w:r>
-      <w:r>
-        <w:rPr>
-          <w:sz w:val="20"/>
-          <w:lang w:val="en-CA"/>
-        </w:rPr>
-        <w:tab/>
-        <w:t xml:space="preserve">C/o Research Office for Administrative Development and Support </w:t>
-      </w:r>
-    </w:p>
-    <w:p>
-      <w:r>
-        <w:rPr>
-          <w:sz w:val="20"/>
-          <w:lang w:val="en-CA"/>
-        </w:rPr>
-        <w:tab/>
-      </w:r>
-      <w:r>
-        <w:rPr>
-          <w:sz w:val="20"/>
-          <w:lang w:val="en-CA"/>
-        </w:rPr>
-        <w:tab/>
-      </w:r>
-      <w:r>
-        <w:rPr>
-          <w:sz w:val="20"/>
-          <w:lang w:val="en-CA"/>
-        </w:rPr>
-        <w:tab/>
-      </w:r>
-      <w:r>
-        <w:rPr>
+        <w:pBdr>
+          <w:bottom w:val="single" w:sz="6" w:space="1" w:color="000000"/>
+        </w:pBdr>
+        <w:rPr>
+          <w:ins w:id="16" w:author="Spencer Smith" w:date="2026-06-12T11:50:00Z"/>
+          <w:sz w:val="20"/>
+          <w:lang w:val="en-CA"/>
+        </w:rPr>
+      </w:pPr>
+      <w:ins w:id="17" w:author="Spencer Smith" w:date="2026-06-12T11:50:00Z">
+        <w:r>
+          <w:rPr>
+            <w:sz w:val="20"/>
+            <w:lang w:val="en-CA"/>
+          </w:rPr>
+          <w:t>This study has been reviewed by the McMaster Research Ethics Board and received ethics clearance under project 8215. If you have concerns or questions about your rights as a participant or about the way the study is conducted, please contact McMaster Research Ethics Office by phone: (905) 525-9140 ext. 23142 or e-mail: mreb@mcmaster.ca.</w:t>
+        </w:r>
+      </w:ins>
+    </w:p>
+    <w:p>
+      <w:pPr>
+        <w:pBdr>
+          <w:bottom w:val="single" w:sz="6" w:space="1" w:color="000000"/>
+        </w:pBdr>
+        <w:rPr>
+          <w:ins w:id="18" w:author="Spencer Smith" w:date="2026-06-12T11:50:00Z" w16du:dateUtc="2026-06-12T15:50:00Z"/>
           <w:sz w:val="20"/>
           <w:lang w:val="it-IT"/>
         </w:rPr>
-        <w:t xml:space="preserve">E-mail: </w:t>
-      </w:r>
-      <w:hyperlink r:id="rId11">
-        <w:r>
-          <w:rPr>
-            <w:rStyle w:val="Hyperlink"/>
-            <w:sz w:val="20"/>
-            <w:lang w:val="it-IT"/>
-          </w:rPr>
-          <w:t>ethicsoffice@mcmaster.ca</w:t>
-        </w:r>
-      </w:hyperlink>
+      </w:pPr>
+    </w:p>
+    <w:p>
+      <w:pPr>
+        <w:pBdr>
+          <w:bottom w:val="single" w:sz="6" w:space="1" w:color="000000"/>
+        </w:pBdr>
+        <w:rPr>
+          <w:ins w:id="19" w:author="Spencer Smith" w:date="2026-06-12T11:50:00Z" w16du:dateUtc="2026-06-12T15:50:00Z"/>
+          <w:sz w:val="20"/>
+          <w:lang w:val="it-IT"/>
+        </w:rPr>
+      </w:pPr>
+    </w:p>
+    <w:p>
+      <w:pPr>
+        <w:pBdr>
+          <w:bottom w:val="single" w:sz="6" w:space="1" w:color="000000"/>
+        </w:pBdr>
+        <w:rPr>
+          <w:ins w:id="20" w:author="Spencer Smith" w:date="2026-06-12T11:50:00Z" w16du:dateUtc="2026-06-12T15:50:00Z"/>
+          <w:sz w:val="20"/>
+          <w:lang w:val="it-IT"/>
+        </w:rPr>
+      </w:pPr>
     </w:p>
     <w:p>
       <w:pPr>
@@ -2902,6 +2987,14 @@
     <w:abstractNumId w:val="2"/>
   </w:num>
 </w:numbering>
+</file>
+
+<file path=word/people.xml><?xml version="1.0" encoding="utf-8"?>
+<w15:people xmlns:wpc="http://schemas.microsoft.com/office/word/2010/wordprocessingCanvas" xmlns:cx="http://schemas.microsoft.com/office/drawing/2014/chartex" xmlns:cx1="http://schemas.microsoft.com/office/drawing/2015/9/8/chartex" xmlns:cx2="http://schemas.microsoft.com/office/drawing/2015/10/21/chartex" xmlns:cx3="http://schemas.microsoft.com/office/drawing/2016/5/9/chartex" xmlns:cx4="http://schemas.microsoft.com/office/drawing/2016/5/10/chartex" xmlns:cx5="http://schemas.microsoft.com/office/drawing/2016/5/11/chartex" xmlns:cx6="http://schemas.microsoft.com/office/drawing/2016/5/12/chartex" xmlns:cx7="http://schemas.microsoft.com/office/drawing/2016/5/13/chartex" xmlns:cx8="http://schemas.microsoft.com/office/drawing/2016/5/14/chartex" xmlns:mc="http://schemas.openxmlformats.org/markup-compatibility/2006" xmlns:aink="http://schemas.microsoft.com/office/drawing/2016/ink" xmlns:am3d="http://schemas.microsoft.com/office/drawing/2017/model3d" xmlns:o="urn:schemas-microsoft-com:office:office" xmlns:oel="http://schemas.microsoft.com/office/2019/extlst" xmlns:r="http://schemas.openxmlformats.org/officeDocument/2006/relationships" xmlns:m="http://schemas.openxmlformats.org/officeDocument/2006/math" xmlns:v="urn:schemas-microsoft-com:vml" xmlns:wp14="http://schemas.microsoft.com/office/word/2010/wordprocessingDrawing" xmlns:wp="http://schemas.openxmlformats.org/drawingml/2006/wordprocessingDrawing" xmlns:w10="urn:schemas-microsoft-com:office:word" xmlns:w="http://schemas.openxmlformats.org/wordprocessingml/2006/main" xmlns:w14="http://schemas.microsoft.com/office/word/2010/wordml" xmlns:w15="http://schemas.microsoft.com/office/word/2012/wordml" xmlns:w16cex="http://schemas.microsoft.com/office/word/2018/wordml/cex" xmlns:w16cid="http://schemas.microsoft.com/office/word/2016/wordml/cid" xmlns:w16="http://schemas.microsoft.com/office/word/2018/wordml" xmlns:w16du="http://schemas.microsoft.com/office/word/2023/wordml/word16du" xmlns:w16sdtdh="http://schemas.microsoft.com/office/word/2020/wordml/sdtdatahash" xmlns:w16sdtfl="http://schemas.microsoft.com/office/word/2024/wordml/sdtformatlock" xmlns:w16se="http://schemas.microsoft.com/office/word/2015/wordml/symex" xmlns:wpg="http://schemas.microsoft.com/office/word/2010/wordprocessingGroup" xmlns:wpi="http://schemas.microsoft.com/office/word/2010/wordprocessingInk" xmlns:wne="http://schemas.microsoft.com/office/word/2006/wordml" xmlns:wps="http://schemas.microsoft.com/office/word/2010/wordprocessingShape" mc:Ignorable="w14 w15 w16se w16cid w16 w16cex w16sdtdh w16sdtfl w16du wp14">
+  <w15:person w15:author="Spencer Smith">
+    <w15:presenceInfo w15:providerId="AD" w15:userId="S::smiths@mcmaster.ca::80185a1f-9ef1-4a10-a8cf-0d62d99a8080"/>
+  </w15:person>
+</w15:people>
 </file>
 
 <file path=word/styles.xml><?xml version="1.0" encoding="utf-8"?>

</xml_diff>

<commit_message>
Updates to ethics stuff
</commit_message>
<xml_diff>
--- a/StateOfPractice/MACREM-2026/SupportingDocuments/Letter-of-Information-Consent-Form2.docx
+++ b/StateOfPractice/MACREM-2026/SupportingDocuments/Letter-of-Information-Consent-Form2.docx
@@ -1,6 +1,6 @@
 
 <file path=word/document.xml><?xml version="1.0" encoding="utf-8"?>
-<w:document xmlns:wpc="http://schemas.microsoft.com/office/word/2010/wordprocessingCanvas" xmlns:cx="http://schemas.microsoft.com/office/drawing/2014/chartex" xmlns:cx1="http://schemas.microsoft.com/office/drawing/2015/9/8/chartex" xmlns:cx2="http://schemas.microsoft.com/office/drawing/2015/10/21/chartex" xmlns:cx3="http://schemas.microsoft.com/office/drawing/2016/5/9/chartex" xmlns:cx4="http://schemas.microsoft.com/office/drawing/2016/5/10/chartex" xmlns:cx5="http://schemas.microsoft.com/office/drawing/2016/5/11/chartex" xmlns:cx6="http://schemas.microsoft.com/office/drawing/2016/5/12/chartex" xmlns:cx7="http://schemas.microsoft.com/office/drawing/2016/5/13/chartex" xmlns:cx8="http://schemas.microsoft.com/office/drawing/2016/5/14/chartex" xmlns:mc="http://schemas.openxmlformats.org/markup-compatibility/2006" xmlns:aink="http://schemas.microsoft.com/office/drawing/2016/ink" xmlns:am3d="http://schemas.microsoft.com/office/drawing/2017/model3d" xmlns:o="urn:schemas-microsoft-com:office:office" xmlns:oel="http://schemas.microsoft.com/office/2019/extlst" xmlns:r="http://schemas.openxmlformats.org/officeDocument/2006/relationships" xmlns:m="http://schemas.openxmlformats.org/officeDocument/2006/math" xmlns:v="urn:schemas-microsoft-com:vml" xmlns:wp14="http://schemas.microsoft.com/office/word/2010/wordprocessingDrawing" xmlns:wp="http://schemas.openxmlformats.org/drawingml/2006/wordprocessingDrawing" xmlns:w10="urn:schemas-microsoft-com:office:word" xmlns:w="http://schemas.openxmlformats.org/wordprocessingml/2006/main" xmlns:w14="http://schemas.microsoft.com/office/word/2010/wordml" xmlns:w15="http://schemas.microsoft.com/office/word/2012/wordml" xmlns:w16cex="http://schemas.microsoft.com/office/word/2018/wordml/cex" xmlns:w16cid="http://schemas.microsoft.com/office/word/2016/wordml/cid" xmlns:w16="http://schemas.microsoft.com/office/word/2018/wordml" xmlns:w16du="http://schemas.microsoft.com/office/word/2023/wordml/word16du" xmlns:w16sdtdh="http://schemas.microsoft.com/office/word/2020/wordml/sdtdatahash" xmlns:w16sdtfl="http://schemas.microsoft.com/office/word/2024/wordml/sdtformatlock" xmlns:w16se="http://schemas.microsoft.com/office/word/2015/wordml/symex" xmlns:wpg="http://schemas.microsoft.com/office/word/2010/wordprocessingGroup" xmlns:wpi="http://schemas.microsoft.com/office/word/2010/wordprocessingInk" xmlns:wne="http://schemas.microsoft.com/office/word/2006/wordml" xmlns:wps="http://schemas.microsoft.com/office/word/2010/wordprocessingShape" mc:Ignorable="w14 w15 w16se w16cid w16 w16cex w16sdtdh w16sdtfl w16du wp14">
+<w:document xmlns:wpc="http://schemas.microsoft.com/office/word/2010/wordprocessingCanvas" xmlns:cx="http://schemas.microsoft.com/office/drawing/2014/chartex" xmlns:cx1="http://schemas.microsoft.com/office/drawing/2015/9/8/chartex" xmlns:cx2="http://schemas.microsoft.com/office/drawing/2015/10/21/chartex" xmlns:cx3="http://schemas.microsoft.com/office/drawing/2016/5/9/chartex" xmlns:cx4="http://schemas.microsoft.com/office/drawing/2016/5/10/chartex" xmlns:cx5="http://schemas.microsoft.com/office/drawing/2016/5/11/chartex" xmlns:cx6="http://schemas.microsoft.com/office/drawing/2016/5/12/chartex" xmlns:cx7="http://schemas.microsoft.com/office/drawing/2016/5/13/chartex" xmlns:cx8="http://schemas.microsoft.com/office/drawing/2016/5/14/chartex" xmlns:mc="http://schemas.openxmlformats.org/markup-compatibility/2006" xmlns:m="http://schemas.openxmlformats.org/officeDocument/2006/math" xmlns:aink="http://schemas.microsoft.com/office/drawing/2016/ink" xmlns:am3d="http://schemas.microsoft.com/office/drawing/2017/model3d" xmlns:oel="http://schemas.microsoft.com/office/2019/extlst" xmlns:r="http://schemas.openxmlformats.org/officeDocument/2006/relationships" xmlns:wp14="http://schemas.microsoft.com/office/word/2010/wordprocessingDrawing" xmlns:wp="http://schemas.openxmlformats.org/drawingml/2006/wordprocessingDrawing" xmlns:wpg="http://schemas.microsoft.com/office/word/2010/wordprocessingGroup" xmlns:wpi="http://schemas.microsoft.com/office/word/2010/wordprocessingInk" xmlns:wps="http://schemas.microsoft.com/office/word/2010/wordprocessingShape" xmlns:o="urn:schemas-microsoft-com:office:office" xmlns:v="urn:schemas-microsoft-com:vml" xmlns:w10="urn:schemas-microsoft-com:office:word" xmlns:w="http://schemas.openxmlformats.org/wordprocessingml/2006/main" xmlns:w14="http://schemas.microsoft.com/office/word/2010/wordml" xmlns:w15="http://schemas.microsoft.com/office/word/2012/wordml" xmlns:w16cex="http://schemas.microsoft.com/office/word/2018/wordml/cex" xmlns:w16cid="http://schemas.microsoft.com/office/word/2016/wordml/cid" xmlns:w16="http://schemas.microsoft.com/office/word/2018/wordml" xmlns:w16sdtdh="http://schemas.microsoft.com/office/word/2020/wordml/sdtdatahash" xmlns:w16sdtfl="http://schemas.microsoft.com/office/word/2024/wordml/sdtformatlock" xmlns:w16se="http://schemas.microsoft.com/office/word/2015/wordml/symex" xmlns:w16du="http://schemas.microsoft.com/office/word/2023/wordml/word16du" xmlns:wne="http://schemas.microsoft.com/office/word/2006/wordml" mc:Ignorable="w14 w15 w16se w16cid w16 w16cex w16sdtdh w16sdtfl w16du wp14">
   <w:body>
     <w:p>
       <w:pPr>
@@ -865,166 +865,281 @@
         </w:rPr>
         <w:tab/>
       </w:r>
-      <w:ins w:id="1" w:author="Spencer Smith" w:date="2026-06-14T16:13:00Z" w16du:dateUtc="2026-06-14T20:13:00Z">
+      <w:r>
+        <w:rPr>
+          <w:sz w:val="20"/>
+          <w:lang w:val="en-CA"/>
+        </w:rPr>
+        <w:tab/>
+      </w:r>
+      <w:r>
+        <w:rPr>
+          <w:sz w:val="20"/>
+          <w:lang w:val="en-CA"/>
+        </w:rPr>
+        <w:tab/>
+        <w:t>Student Investigator</w:t>
+      </w:r>
+      <w:r>
+        <w:rPr>
+          <w:sz w:val="20"/>
+          <w:lang w:val="en-CA"/>
+        </w:rPr>
+        <w:tab/>
+      </w:r>
+      <w:r>
+        <w:rPr>
+          <w:sz w:val="20"/>
+          <w:lang w:val="en-CA"/>
+        </w:rPr>
+        <w:tab/>
+      </w:r>
+    </w:p>
+    <w:p>
+      <w:pPr>
+        <w:rPr>
+          <w:sz w:val="20"/>
+          <w:lang w:val="en-CA"/>
+        </w:rPr>
+      </w:pPr>
+      <w:r>
+        <w:rPr>
+          <w:sz w:val="20"/>
+          <w:lang w:val="en-CA"/>
+        </w:rPr>
+        <w:t>Ziyang Fang</w:t>
+      </w:r>
+      <w:r>
+        <w:rPr>
+          <w:sz w:val="20"/>
+          <w:lang w:val="en-CA"/>
+        </w:rPr>
+        <w:tab/>
+      </w:r>
+      <w:r>
+        <w:rPr>
+          <w:sz w:val="20"/>
+          <w:lang w:val="en-CA"/>
+        </w:rPr>
+        <w:tab/>
+      </w:r>
+      <w:r>
+        <w:rPr>
+          <w:sz w:val="20"/>
+          <w:lang w:val="en-CA"/>
+        </w:rPr>
+        <w:tab/>
+      </w:r>
+      <w:r>
+        <w:rPr>
+          <w:sz w:val="20"/>
+          <w:lang w:val="en-CA"/>
+        </w:rPr>
+        <w:tab/>
+        <w:t>Christopher Schankula</w:t>
+      </w:r>
+    </w:p>
+    <w:p>
+      <w:r>
+        <w:rPr>
+          <w:sz w:val="20"/>
+          <w:lang w:val="en-CA"/>
+        </w:rPr>
+        <w:t>Computing and Software Department</w:t>
+      </w:r>
+      <w:r>
+        <w:rPr>
+          <w:sz w:val="20"/>
+          <w:lang w:val="en-CA"/>
+        </w:rPr>
+        <w:tab/>
+        <w:t>Computing and Software Department</w:t>
+      </w:r>
+    </w:p>
+    <w:p>
+      <w:r>
+        <w:rPr>
+          <w:sz w:val="20"/>
+          <w:lang w:val="en-CA"/>
+        </w:rPr>
+        <w:t>Department of</w:t>
+      </w:r>
+      <w:r>
+        <w:rPr>
+          <w:b/>
+          <w:sz w:val="20"/>
+          <w:lang w:val="en-CA"/>
+        </w:rPr>
+        <w:t xml:space="preserve"> </w:t>
+      </w:r>
+      <w:r>
+        <w:rPr>
+          <w:sz w:val="20"/>
+          <w:lang w:val="en-CA"/>
+        </w:rPr>
+        <w:t>Engineering</w:t>
+      </w:r>
+      <w:r>
+        <w:rPr>
+          <w:sz w:val="20"/>
+          <w:lang w:val="en-CA"/>
+        </w:rPr>
+        <w:tab/>
+      </w:r>
+      <w:r>
+        <w:rPr>
+          <w:sz w:val="20"/>
+          <w:lang w:val="en-CA"/>
+        </w:rPr>
+        <w:tab/>
+      </w:r>
+      <w:r>
+        <w:rPr>
+          <w:sz w:val="20"/>
+          <w:lang w:val="en-CA"/>
+        </w:rPr>
+        <w:t>Department of Engineering</w:t>
+      </w:r>
+    </w:p>
+    <w:p>
+      <w:r>
+        <w:rPr>
+          <w:sz w:val="20"/>
+          <w:lang w:val="en-CA"/>
+        </w:rPr>
+        <w:t>McMaster University</w:t>
+      </w:r>
+      <w:r>
+        <w:rPr>
+          <w:sz w:val="20"/>
+          <w:lang w:val="en-CA"/>
+        </w:rPr>
+        <w:tab/>
+      </w:r>
+      <w:r>
+        <w:rPr>
+          <w:sz w:val="20"/>
+          <w:lang w:val="en-CA"/>
+        </w:rPr>
+        <w:tab/>
+      </w:r>
+      <w:r>
+        <w:rPr>
+          <w:sz w:val="20"/>
+          <w:lang w:val="en-CA"/>
+        </w:rPr>
+        <w:tab/>
+      </w:r>
+      <w:r>
+        <w:rPr>
+          <w:sz w:val="20"/>
+          <w:lang w:val="en-CA"/>
+        </w:rPr>
+        <w:t>McMaster University</w:t>
+      </w:r>
+    </w:p>
+    <w:p>
+      <w:r>
+        <w:rPr>
+          <w:sz w:val="20"/>
+          <w:lang w:val="it-IT"/>
+        </w:rPr>
+        <w:t>Hamilton, Ontario, Canada</w:t>
+      </w:r>
+      <w:r>
+        <w:rPr>
+          <w:sz w:val="20"/>
+          <w:lang w:val="it-IT"/>
+        </w:rPr>
+        <w:tab/>
+      </w:r>
+      <w:r>
+        <w:rPr>
+          <w:sz w:val="20"/>
+          <w:lang w:val="it-IT"/>
+        </w:rPr>
+        <w:tab/>
+      </w:r>
+      <w:r>
+        <w:rPr>
+          <w:sz w:val="20"/>
+          <w:lang w:val="it-IT"/>
+        </w:rPr>
+        <w:t>Hamilton, Ontario, Canada</w:t>
+      </w:r>
+    </w:p>
+    <w:p>
+      <w:r>
+        <w:rPr>
+          <w:b/>
+          <w:sz w:val="20"/>
+          <w:lang w:val="en-CA"/>
+        </w:rPr>
+        <w:t>(905) 525-9140</w:t>
+      </w:r>
+      <w:r>
+        <w:rPr>
+          <w:b/>
+          <w:sz w:val="20"/>
+          <w:lang w:val="en-CA"/>
+        </w:rPr>
+        <w:tab/>
+      </w:r>
+      <w:r>
+        <w:rPr>
+          <w:b/>
+          <w:sz w:val="20"/>
+          <w:lang w:val="en-CA"/>
+        </w:rPr>
+        <w:tab/>
+      </w:r>
+      <w:r>
+        <w:rPr>
+          <w:b/>
+          <w:sz w:val="20"/>
+          <w:lang w:val="en-CA"/>
+        </w:rPr>
+        <w:tab/>
+      </w:r>
+      <w:bookmarkStart w:id="1" w:name="__DdeLink__874_9832321141"/>
+      <w:r>
+        <w:rPr>
+          <w:b/>
+          <w:sz w:val="20"/>
+          <w:lang w:val="en-CA"/>
+        </w:rPr>
+        <w:tab/>
+      </w:r>
+      <w:bookmarkEnd w:id="1"/>
+      <w:r>
+        <w:rPr>
+          <w:b/>
+          <w:sz w:val="20"/>
+          <w:lang w:val="en-CA"/>
+        </w:rPr>
+        <w:t>(905) 525-9140</w:t>
+      </w:r>
+    </w:p>
+    <w:p>
+      <w:r>
+        <w:rPr>
+          <w:b/>
+          <w:sz w:val="20"/>
+          <w:lang w:val="en-CA"/>
+        </w:rPr>
+        <w:t xml:space="preserve">E-mail: </w:t>
+      </w:r>
+      <w:hyperlink r:id="rId10" w:history="1">
         <w:r>
           <w:rPr>
-            <w:sz w:val="20"/>
-            <w:lang w:val="en-CA"/>
-          </w:rPr>
-          <w:tab/>
-        </w:r>
-        <w:r>
-          <w:rPr>
-            <w:sz w:val="20"/>
-            <w:lang w:val="en-CA"/>
-          </w:rPr>
-          <w:tab/>
-        </w:r>
-      </w:ins>
-      <w:ins w:id="2" w:author="Spencer Smith" w:date="2026-06-14T16:14:00Z" w16du:dateUtc="2026-06-14T20:14:00Z">
-        <w:r>
-          <w:rPr>
-            <w:sz w:val="20"/>
-            <w:lang w:val="en-CA"/>
-          </w:rPr>
-          <w:t>Student Investigator</w:t>
-        </w:r>
-      </w:ins>
-      <w:r>
-        <w:rPr>
-          <w:sz w:val="20"/>
-          <w:lang w:val="en-CA"/>
-        </w:rPr>
-        <w:tab/>
-      </w:r>
-      <w:r>
-        <w:rPr>
-          <w:sz w:val="20"/>
-          <w:lang w:val="en-CA"/>
-        </w:rPr>
-        <w:tab/>
-      </w:r>
-    </w:p>
-    <w:p>
-      <w:pPr>
-        <w:rPr>
-          <w:sz w:val="20"/>
-          <w:lang w:val="en-CA"/>
-        </w:rPr>
-      </w:pPr>
-      <w:r>
-        <w:rPr>
-          <w:sz w:val="20"/>
-          <w:lang w:val="en-CA"/>
-        </w:rPr>
-        <w:t>Ziyang Fang</w:t>
-      </w:r>
-      <w:ins w:id="3" w:author="Spencer Smith" w:date="2026-06-14T16:14:00Z" w16du:dateUtc="2026-06-14T20:14:00Z">
-        <w:r>
-          <w:rPr>
-            <w:sz w:val="20"/>
-            <w:lang w:val="en-CA"/>
-          </w:rPr>
-          <w:tab/>
-        </w:r>
-        <w:r>
-          <w:rPr>
-            <w:sz w:val="20"/>
-            <w:lang w:val="en-CA"/>
-          </w:rPr>
-          <w:tab/>
-        </w:r>
-        <w:r>
-          <w:rPr>
-            <w:sz w:val="20"/>
-            <w:lang w:val="en-CA"/>
-          </w:rPr>
-          <w:tab/>
-        </w:r>
-        <w:r>
-          <w:rPr>
-            <w:sz w:val="20"/>
-            <w:lang w:val="en-CA"/>
-          </w:rPr>
-          <w:tab/>
-          <w:t>Christopher Schankula</w:t>
-        </w:r>
-      </w:ins>
-    </w:p>
-    <w:p>
-      <w:r>
-        <w:rPr>
-          <w:sz w:val="20"/>
-          <w:lang w:val="en-CA"/>
-        </w:rPr>
-        <w:t>Computing and Software Department</w:t>
-      </w:r>
-      <w:ins w:id="4" w:author="Spencer Smith" w:date="2026-06-14T16:14:00Z" w16du:dateUtc="2026-06-14T20:14:00Z">
-        <w:r>
-          <w:rPr>
-            <w:sz w:val="20"/>
-            <w:lang w:val="en-CA"/>
-          </w:rPr>
-          <w:tab/>
-          <w:t>Computing and Software Department</w:t>
-        </w:r>
-      </w:ins>
-      <w:del w:id="5" w:author="Spencer Smith" w:date="2026-06-14T16:14:00Z" w16du:dateUtc="2026-06-14T20:14:00Z">
-        <w:r>
-          <w:rPr>
-            <w:sz w:val="20"/>
-            <w:lang w:val="en-CA"/>
-          </w:rPr>
-          <w:tab/>
-        </w:r>
-        <w:r>
-          <w:rPr>
-            <w:sz w:val="20"/>
-            <w:lang w:val="en-CA"/>
-          </w:rPr>
-          <w:tab/>
-        </w:r>
-        <w:r>
-          <w:rPr>
-            <w:sz w:val="20"/>
-            <w:lang w:val="en-CA"/>
-          </w:rPr>
-          <w:tab/>
-        </w:r>
-        <w:r>
-          <w:rPr>
+            <w:rStyle w:val="Hyperlink"/>
             <w:b/>
             <w:sz w:val="20"/>
             <w:lang w:val="en-CA"/>
           </w:rPr>
-          <w:tab/>
+          <w:t>fangz58@mcmaster.ca</w:t>
         </w:r>
-        <w:r>
-          <w:rPr>
-            <w:b/>
-            <w:sz w:val="20"/>
-            <w:lang w:val="en-CA"/>
-          </w:rPr>
-          <w:tab/>
-        </w:r>
-        <w:r>
-          <w:rPr>
-            <w:b/>
-            <w:sz w:val="20"/>
-            <w:lang w:val="en-CA"/>
-          </w:rPr>
-          <w:tab/>
-        </w:r>
-      </w:del>
-    </w:p>
-    <w:p>
-      <w:r>
-        <w:rPr>
-          <w:sz w:val="20"/>
-          <w:lang w:val="en-CA"/>
-        </w:rPr>
-        <w:t>Department of</w:t>
-      </w:r>
+      </w:hyperlink>
       <w:r>
         <w:rPr>
           <w:b/>
@@ -1035,268 +1150,21 @@
       </w:r>
       <w:r>
         <w:rPr>
-          <w:sz w:val="20"/>
-          <w:lang w:val="en-CA"/>
-        </w:rPr>
-        <w:t>Engineering</w:t>
-      </w:r>
-      <w:r>
-        <w:rPr>
-          <w:sz w:val="20"/>
-          <w:lang w:val="en-CA"/>
-        </w:rPr>
-        <w:tab/>
-      </w:r>
-      <w:r>
-        <w:rPr>
-          <w:sz w:val="20"/>
-          <w:lang w:val="en-CA"/>
-        </w:rPr>
-        <w:tab/>
-      </w:r>
-      <w:ins w:id="6" w:author="Spencer Smith" w:date="2026-06-14T16:14:00Z" w16du:dateUtc="2026-06-14T20:14:00Z">
-        <w:r>
-          <w:rPr>
-            <w:sz w:val="20"/>
-            <w:lang w:val="en-CA"/>
-          </w:rPr>
-          <w:t>Department of Engineering</w:t>
-        </w:r>
-      </w:ins>
-    </w:p>
-    <w:p>
-      <w:r>
-        <w:rPr>
-          <w:sz w:val="20"/>
-          <w:lang w:val="en-CA"/>
-        </w:rPr>
-        <w:t>McMaster University</w:t>
-      </w:r>
-      <w:r>
-        <w:rPr>
-          <w:sz w:val="20"/>
-          <w:lang w:val="en-CA"/>
-        </w:rPr>
-        <w:tab/>
-      </w:r>
-      <w:r>
-        <w:rPr>
-          <w:sz w:val="20"/>
-          <w:lang w:val="en-CA"/>
-        </w:rPr>
-        <w:tab/>
-      </w:r>
-      <w:r>
-        <w:rPr>
-          <w:sz w:val="20"/>
-          <w:lang w:val="en-CA"/>
-        </w:rPr>
-        <w:tab/>
-      </w:r>
-      <w:ins w:id="7" w:author="Spencer Smith" w:date="2026-06-14T16:14:00Z" w16du:dateUtc="2026-06-14T20:14:00Z">
-        <w:r>
-          <w:rPr>
-            <w:sz w:val="20"/>
-            <w:lang w:val="en-CA"/>
-          </w:rPr>
-          <w:t>McMaster University</w:t>
-        </w:r>
-      </w:ins>
-    </w:p>
-    <w:p>
-      <w:r>
-        <w:rPr>
-          <w:sz w:val="20"/>
-          <w:lang w:val="it-IT"/>
-        </w:rPr>
-        <w:t>Hamilton, Ontario, Canada</w:t>
-      </w:r>
-      <w:r>
-        <w:rPr>
-          <w:sz w:val="20"/>
-          <w:lang w:val="it-IT"/>
-        </w:rPr>
-        <w:tab/>
-      </w:r>
-      <w:r>
-        <w:rPr>
-          <w:sz w:val="20"/>
-          <w:lang w:val="it-IT"/>
-        </w:rPr>
-        <w:tab/>
-      </w:r>
-      <w:ins w:id="8" w:author="Spencer Smith" w:date="2026-06-14T16:14:00Z" w16du:dateUtc="2026-06-14T20:14:00Z">
-        <w:r>
-          <w:rPr>
-            <w:sz w:val="20"/>
-            <w:lang w:val="it-IT"/>
-          </w:rPr>
-          <w:t>Hamilton, Ontario, Canada</w:t>
-        </w:r>
-      </w:ins>
-    </w:p>
-    <w:p>
-      <w:r>
-        <w:rPr>
-          <w:b/>
-          <w:sz w:val="20"/>
-          <w:lang w:val="en-CA"/>
-        </w:rPr>
-        <w:t>(905) 525-9140</w:t>
-      </w:r>
-      <w:r>
-        <w:rPr>
-          <w:b/>
-          <w:sz w:val="20"/>
-          <w:lang w:val="en-CA"/>
-        </w:rPr>
-        <w:tab/>
-      </w:r>
-      <w:r>
-        <w:rPr>
-          <w:b/>
-          <w:sz w:val="20"/>
-          <w:lang w:val="en-CA"/>
-        </w:rPr>
-        <w:tab/>
-      </w:r>
-      <w:r>
-        <w:rPr>
-          <w:b/>
-          <w:sz w:val="20"/>
-          <w:lang w:val="en-CA"/>
-        </w:rPr>
-        <w:tab/>
-      </w:r>
-      <w:bookmarkStart w:id="9" w:name="__DdeLink__874_9832321141"/>
-      <w:r>
-        <w:rPr>
-          <w:b/>
-          <w:sz w:val="20"/>
-          <w:lang w:val="en-CA"/>
-        </w:rPr>
-        <w:tab/>
-      </w:r>
-      <w:bookmarkEnd w:id="9"/>
-      <w:ins w:id="10" w:author="Spencer Smith" w:date="2026-06-14T16:14:00Z" w16du:dateUtc="2026-06-14T20:14:00Z">
-        <w:r>
-          <w:rPr>
-            <w:b/>
-            <w:sz w:val="20"/>
-            <w:lang w:val="en-CA"/>
-          </w:rPr>
-          <w:t>(905) 525-9140</w:t>
-        </w:r>
-      </w:ins>
-    </w:p>
-    <w:p>
-      <w:r>
-        <w:rPr>
-          <w:b/>
-          <w:sz w:val="20"/>
-          <w:lang w:val="en-CA"/>
-        </w:rPr>
+          <w:b/>
+          <w:sz w:val="20"/>
+          <w:lang w:val="en-CA"/>
+        </w:rPr>
+        <w:tab/>
         <w:t xml:space="preserve">E-mail: </w:t>
       </w:r>
-      <w:ins w:id="11" w:author="Spencer Smith" w:date="2026-06-14T16:14:00Z" w16du:dateUtc="2026-06-14T20:14:00Z">
-        <w:r>
-          <w:rPr>
-            <w:b/>
-            <w:sz w:val="20"/>
-            <w:lang w:val="en-CA"/>
-          </w:rPr>
-          <w:fldChar w:fldCharType="begin"/>
-        </w:r>
-        <w:r>
-          <w:rPr>
-            <w:b/>
-            <w:sz w:val="20"/>
-            <w:lang w:val="en-CA"/>
-          </w:rPr>
-          <w:instrText>HYPERLINK "mailto:</w:instrText>
-        </w:r>
-      </w:ins>
-      <w:r>
-        <w:rPr>
-          <w:b/>
-          <w:sz w:val="20"/>
-          <w:lang w:val="en-CA"/>
-        </w:rPr>
-        <w:instrText>fangz58@mcmaster.ca</w:instrText>
-      </w:r>
-      <w:ins w:id="12" w:author="Spencer Smith" w:date="2026-06-14T16:14:00Z" w16du:dateUtc="2026-06-14T20:14:00Z">
-        <w:r>
-          <w:rPr>
-            <w:b/>
-            <w:sz w:val="20"/>
-            <w:lang w:val="en-CA"/>
-          </w:rPr>
-          <w:instrText>"</w:instrText>
-        </w:r>
-        <w:r>
-          <w:rPr>
-            <w:b/>
-            <w:sz w:val="20"/>
-            <w:lang w:val="en-CA"/>
-          </w:rPr>
-        </w:r>
-        <w:r>
-          <w:rPr>
-            <w:b/>
-            <w:sz w:val="20"/>
-            <w:lang w:val="en-CA"/>
-          </w:rPr>
-          <w:fldChar w:fldCharType="separate"/>
-        </w:r>
-      </w:ins>
-      <w:r>
-        <w:rPr>
-          <w:rStyle w:val="Hyperlink"/>
-          <w:b/>
-          <w:sz w:val="20"/>
-          <w:lang w:val="en-CA"/>
-        </w:rPr>
-        <w:t>fangz58@mcmaster.ca</w:t>
-      </w:r>
-      <w:ins w:id="13" w:author="Spencer Smith" w:date="2026-06-14T16:14:00Z" w16du:dateUtc="2026-06-14T20:14:00Z">
-        <w:r>
-          <w:rPr>
-            <w:b/>
-            <w:sz w:val="20"/>
-            <w:lang w:val="en-CA"/>
-          </w:rPr>
-          <w:fldChar w:fldCharType="end"/>
-        </w:r>
-      </w:ins>
-      <w:r>
-        <w:rPr>
-          <w:b/>
-          <w:sz w:val="20"/>
-          <w:lang w:val="en-CA"/>
-        </w:rPr>
-        <w:t xml:space="preserve"> </w:t>
-      </w:r>
-      <w:ins w:id="14" w:author="Spencer Smith" w:date="2026-06-14T16:14:00Z" w16du:dateUtc="2026-06-14T20:14:00Z">
-        <w:r>
-          <w:rPr>
-            <w:b/>
-            <w:sz w:val="20"/>
-            <w:lang w:val="en-CA"/>
-          </w:rPr>
-          <w:tab/>
-          <w:t xml:space="preserve">E-mail: </w:t>
-        </w:r>
-      </w:ins>
-      <w:ins w:id="15" w:author="Spencer Smith" w:date="2026-06-14T16:15:00Z" w16du:dateUtc="2026-06-14T20:15:00Z">
-        <w:r>
-          <w:rPr>
-            <w:b/>
-            <w:sz w:val="20"/>
-            <w:lang w:val="en-CA"/>
-          </w:rPr>
-          <w:t>schankuc@mcmaster.ca</w:t>
-        </w:r>
-      </w:ins>
+      <w:r>
+        <w:rPr>
+          <w:b/>
+          <w:sz w:val="20"/>
+          <w:lang w:val="en-CA"/>
+        </w:rPr>
+        <w:t>schankuc@mcmaster.ca</w:t>
+      </w:r>
     </w:p>
     <w:p>
       <w:r>
@@ -2023,7 +1891,7 @@
         </w:rPr>
         <w:t xml:space="preserve"> If you have questions or need more information about the study itself, please contact me at </w:t>
       </w:r>
-      <w:hyperlink r:id="rId10" w:history="1">
+      <w:hyperlink r:id="rId11" w:history="1">
         <w:r>
           <w:rPr>
             <w:rStyle w:val="Hyperlink"/>
@@ -2058,20 +1926,17 @@
           <w:bottom w:val="single" w:sz="6" w:space="1" w:color="000000"/>
         </w:pBdr>
         <w:rPr>
-          <w:ins w:id="16" w:author="Spencer Smith" w:date="2026-06-12T11:50:00Z"/>
-          <w:sz w:val="20"/>
-          <w:lang w:val="en-CA"/>
-        </w:rPr>
-      </w:pPr>
-      <w:ins w:id="17" w:author="Spencer Smith" w:date="2026-06-12T11:50:00Z">
-        <w:r>
-          <w:rPr>
-            <w:sz w:val="20"/>
-            <w:lang w:val="en-CA"/>
-          </w:rPr>
-          <w:t>This study has been reviewed by the McMaster Research Ethics Board and received ethics clearance under project 8215. If you have concerns or questions about your rights as a participant or about the way the study is conducted, please contact McMaster Research Ethics Office by phone: (905) 525-9140 ext. 23142 or e-mail: mreb@mcmaster.ca.</w:t>
-        </w:r>
-      </w:ins>
+          <w:sz w:val="20"/>
+          <w:lang w:val="en-CA"/>
+        </w:rPr>
+      </w:pPr>
+      <w:r>
+        <w:rPr>
+          <w:sz w:val="20"/>
+          <w:lang w:val="en-CA"/>
+        </w:rPr>
+        <w:t>This study has been reviewed by the McMaster Research Ethics Board and received ethics clearance under project 8215. If you have concerns or questions about your rights as a participant or about the way the study is conducted, please contact McMaster Research Ethics Office by phone: (905) 525-9140 ext. 23142 or e-mail: mreb@mcmaster.ca.</w:t>
+      </w:r>
     </w:p>
     <w:p>
       <w:pPr>
@@ -2079,7 +1944,6 @@
           <w:bottom w:val="single" w:sz="6" w:space="1" w:color="000000"/>
         </w:pBdr>
         <w:rPr>
-          <w:ins w:id="18" w:author="Spencer Smith" w:date="2026-06-12T11:50:00Z" w16du:dateUtc="2026-06-12T15:50:00Z"/>
           <w:sz w:val="20"/>
           <w:lang w:val="it-IT"/>
         </w:rPr>
@@ -2091,7 +1955,6 @@
           <w:bottom w:val="single" w:sz="6" w:space="1" w:color="000000"/>
         </w:pBdr>
         <w:rPr>
-          <w:ins w:id="19" w:author="Spencer Smith" w:date="2026-06-12T11:50:00Z" w16du:dateUtc="2026-06-12T15:50:00Z"/>
           <w:sz w:val="20"/>
           <w:lang w:val="it-IT"/>
         </w:rPr>
@@ -2103,7 +1966,6 @@
           <w:bottom w:val="single" w:sz="6" w:space="1" w:color="000000"/>
         </w:pBdr>
         <w:rPr>
-          <w:ins w:id="20" w:author="Spencer Smith" w:date="2026-06-12T11:50:00Z" w16du:dateUtc="2026-06-12T15:50:00Z"/>
           <w:sz w:val="20"/>
           <w:lang w:val="it-IT"/>
         </w:rPr>
@@ -2365,7 +2227,7 @@
 </file>
 
 <file path=word/endnotes.xml><?xml version="1.0" encoding="utf-8"?>
-<w:endnotes xmlns:wpc="http://schemas.microsoft.com/office/word/2010/wordprocessingCanvas" xmlns:cx="http://schemas.microsoft.com/office/drawing/2014/chartex" xmlns:cx1="http://schemas.microsoft.com/office/drawing/2015/9/8/chartex" xmlns:cx2="http://schemas.microsoft.com/office/drawing/2015/10/21/chartex" xmlns:cx3="http://schemas.microsoft.com/office/drawing/2016/5/9/chartex" xmlns:cx4="http://schemas.microsoft.com/office/drawing/2016/5/10/chartex" xmlns:cx5="http://schemas.microsoft.com/office/drawing/2016/5/11/chartex" xmlns:cx6="http://schemas.microsoft.com/office/drawing/2016/5/12/chartex" xmlns:cx7="http://schemas.microsoft.com/office/drawing/2016/5/13/chartex" xmlns:cx8="http://schemas.microsoft.com/office/drawing/2016/5/14/chartex" xmlns:mc="http://schemas.openxmlformats.org/markup-compatibility/2006" xmlns:aink="http://schemas.microsoft.com/office/drawing/2016/ink" xmlns:am3d="http://schemas.microsoft.com/office/drawing/2017/model3d" xmlns:o="urn:schemas-microsoft-com:office:office" xmlns:oel="http://schemas.microsoft.com/office/2019/extlst" xmlns:r="http://schemas.openxmlformats.org/officeDocument/2006/relationships" xmlns:m="http://schemas.openxmlformats.org/officeDocument/2006/math" xmlns:v="urn:schemas-microsoft-com:vml" xmlns:wp14="http://schemas.microsoft.com/office/word/2010/wordprocessingDrawing" xmlns:wp="http://schemas.openxmlformats.org/drawingml/2006/wordprocessingDrawing" xmlns:w10="urn:schemas-microsoft-com:office:word" xmlns:w="http://schemas.openxmlformats.org/wordprocessingml/2006/main" xmlns:w14="http://schemas.microsoft.com/office/word/2010/wordml" xmlns:w15="http://schemas.microsoft.com/office/word/2012/wordml" xmlns:w16cex="http://schemas.microsoft.com/office/word/2018/wordml/cex" xmlns:w16cid="http://schemas.microsoft.com/office/word/2016/wordml/cid" xmlns:w16="http://schemas.microsoft.com/office/word/2018/wordml" xmlns:w16du="http://schemas.microsoft.com/office/word/2023/wordml/word16du" xmlns:w16sdtdh="http://schemas.microsoft.com/office/word/2020/wordml/sdtdatahash" xmlns:w16sdtfl="http://schemas.microsoft.com/office/word/2024/wordml/sdtformatlock" xmlns:w16se="http://schemas.microsoft.com/office/word/2015/wordml/symex" xmlns:wpg="http://schemas.microsoft.com/office/word/2010/wordprocessingGroup" xmlns:wpi="http://schemas.microsoft.com/office/word/2010/wordprocessingInk" xmlns:wne="http://schemas.microsoft.com/office/word/2006/wordml" xmlns:wps="http://schemas.microsoft.com/office/word/2010/wordprocessingShape" mc:Ignorable="w14 w15 w16se w16cid w16 w16cex w16sdtdh w16sdtfl w16du wp14">
+<w:endnotes xmlns:wpc="http://schemas.microsoft.com/office/word/2010/wordprocessingCanvas" xmlns:cx="http://schemas.microsoft.com/office/drawing/2014/chartex" xmlns:cx1="http://schemas.microsoft.com/office/drawing/2015/9/8/chartex" xmlns:cx2="http://schemas.microsoft.com/office/drawing/2015/10/21/chartex" xmlns:cx3="http://schemas.microsoft.com/office/drawing/2016/5/9/chartex" xmlns:cx4="http://schemas.microsoft.com/office/drawing/2016/5/10/chartex" xmlns:cx5="http://schemas.microsoft.com/office/drawing/2016/5/11/chartex" xmlns:cx6="http://schemas.microsoft.com/office/drawing/2016/5/12/chartex" xmlns:cx7="http://schemas.microsoft.com/office/drawing/2016/5/13/chartex" xmlns:cx8="http://schemas.microsoft.com/office/drawing/2016/5/14/chartex" xmlns:mc="http://schemas.openxmlformats.org/markup-compatibility/2006" xmlns:m="http://schemas.openxmlformats.org/officeDocument/2006/math" xmlns:aink="http://schemas.microsoft.com/office/drawing/2016/ink" xmlns:am3d="http://schemas.microsoft.com/office/drawing/2017/model3d" xmlns:oel="http://schemas.microsoft.com/office/2019/extlst" xmlns:r="http://schemas.openxmlformats.org/officeDocument/2006/relationships" xmlns:wp14="http://schemas.microsoft.com/office/word/2010/wordprocessingDrawing" xmlns:wp="http://schemas.openxmlformats.org/drawingml/2006/wordprocessingDrawing" xmlns:wpg="http://schemas.microsoft.com/office/word/2010/wordprocessingGroup" xmlns:wpi="http://schemas.microsoft.com/office/word/2010/wordprocessingInk" xmlns:wps="http://schemas.microsoft.com/office/word/2010/wordprocessingShape" xmlns:o="urn:schemas-microsoft-com:office:office" xmlns:v="urn:schemas-microsoft-com:vml" xmlns:w10="urn:schemas-microsoft-com:office:word" xmlns:w="http://schemas.openxmlformats.org/wordprocessingml/2006/main" xmlns:w14="http://schemas.microsoft.com/office/word/2010/wordml" xmlns:w15="http://schemas.microsoft.com/office/word/2012/wordml" xmlns:w16cex="http://schemas.microsoft.com/office/word/2018/wordml/cex" xmlns:w16cid="http://schemas.microsoft.com/office/word/2016/wordml/cid" xmlns:w16="http://schemas.microsoft.com/office/word/2018/wordml" xmlns:w16sdtdh="http://schemas.microsoft.com/office/word/2020/wordml/sdtdatahash" xmlns:w16sdtfl="http://schemas.microsoft.com/office/word/2024/wordml/sdtformatlock" xmlns:w16se="http://schemas.microsoft.com/office/word/2015/wordml/symex" xmlns:w16du="http://schemas.microsoft.com/office/word/2023/wordml/word16du" xmlns:wne="http://schemas.microsoft.com/office/word/2006/wordml" mc:Ignorable="w14 w15 w16se w16cid w16 w16cex w16sdtdh w16sdtfl w16du wp14">
   <w:endnote w:type="separator" w:id="-1">
     <w:p>
       <w:r>
@@ -2384,7 +2246,7 @@
 </file>
 
 <file path=word/footer1.xml><?xml version="1.0" encoding="utf-8"?>
-<w:ftr xmlns:wpc="http://schemas.microsoft.com/office/word/2010/wordprocessingCanvas" xmlns:cx="http://schemas.microsoft.com/office/drawing/2014/chartex" xmlns:cx1="http://schemas.microsoft.com/office/drawing/2015/9/8/chartex" xmlns:cx2="http://schemas.microsoft.com/office/drawing/2015/10/21/chartex" xmlns:cx3="http://schemas.microsoft.com/office/drawing/2016/5/9/chartex" xmlns:cx4="http://schemas.microsoft.com/office/drawing/2016/5/10/chartex" xmlns:cx5="http://schemas.microsoft.com/office/drawing/2016/5/11/chartex" xmlns:cx6="http://schemas.microsoft.com/office/drawing/2016/5/12/chartex" xmlns:cx7="http://schemas.microsoft.com/office/drawing/2016/5/13/chartex" xmlns:cx8="http://schemas.microsoft.com/office/drawing/2016/5/14/chartex" xmlns:mc="http://schemas.openxmlformats.org/markup-compatibility/2006" xmlns:aink="http://schemas.microsoft.com/office/drawing/2016/ink" xmlns:am3d="http://schemas.microsoft.com/office/drawing/2017/model3d" xmlns:o="urn:schemas-microsoft-com:office:office" xmlns:oel="http://schemas.microsoft.com/office/2019/extlst" xmlns:r="http://schemas.openxmlformats.org/officeDocument/2006/relationships" xmlns:m="http://schemas.openxmlformats.org/officeDocument/2006/math" xmlns:v="urn:schemas-microsoft-com:vml" xmlns:wp14="http://schemas.microsoft.com/office/word/2010/wordprocessingDrawing" xmlns:wp="http://schemas.openxmlformats.org/drawingml/2006/wordprocessingDrawing" xmlns:w10="urn:schemas-microsoft-com:office:word" xmlns:w="http://schemas.openxmlformats.org/wordprocessingml/2006/main" xmlns:w14="http://schemas.microsoft.com/office/word/2010/wordml" xmlns:w15="http://schemas.microsoft.com/office/word/2012/wordml" xmlns:w16cex="http://schemas.microsoft.com/office/word/2018/wordml/cex" xmlns:w16cid="http://schemas.microsoft.com/office/word/2016/wordml/cid" xmlns:w16="http://schemas.microsoft.com/office/word/2018/wordml" xmlns:w16du="http://schemas.microsoft.com/office/word/2023/wordml/word16du" xmlns:w16sdtdh="http://schemas.microsoft.com/office/word/2020/wordml/sdtdatahash" xmlns:w16sdtfl="http://schemas.microsoft.com/office/word/2024/wordml/sdtformatlock" xmlns:w16se="http://schemas.microsoft.com/office/word/2015/wordml/symex" xmlns:wpg="http://schemas.microsoft.com/office/word/2010/wordprocessingGroup" xmlns:wpi="http://schemas.microsoft.com/office/word/2010/wordprocessingInk" xmlns:wne="http://schemas.microsoft.com/office/word/2006/wordml" xmlns:wps="http://schemas.microsoft.com/office/word/2010/wordprocessingShape" mc:Ignorable="w14 w15 w16se w16cid w16 w16cex w16sdtdh w16sdtfl w16du wp14">
+<w:ftr xmlns:wpc="http://schemas.microsoft.com/office/word/2010/wordprocessingCanvas" xmlns:cx="http://schemas.microsoft.com/office/drawing/2014/chartex" xmlns:cx1="http://schemas.microsoft.com/office/drawing/2015/9/8/chartex" xmlns:cx2="http://schemas.microsoft.com/office/drawing/2015/10/21/chartex" xmlns:cx3="http://schemas.microsoft.com/office/drawing/2016/5/9/chartex" xmlns:cx4="http://schemas.microsoft.com/office/drawing/2016/5/10/chartex" xmlns:cx5="http://schemas.microsoft.com/office/drawing/2016/5/11/chartex" xmlns:cx6="http://schemas.microsoft.com/office/drawing/2016/5/12/chartex" xmlns:cx7="http://schemas.microsoft.com/office/drawing/2016/5/13/chartex" xmlns:cx8="http://schemas.microsoft.com/office/drawing/2016/5/14/chartex" xmlns:mc="http://schemas.openxmlformats.org/markup-compatibility/2006" xmlns:m="http://schemas.openxmlformats.org/officeDocument/2006/math" xmlns:aink="http://schemas.microsoft.com/office/drawing/2016/ink" xmlns:am3d="http://schemas.microsoft.com/office/drawing/2017/model3d" xmlns:oel="http://schemas.microsoft.com/office/2019/extlst" xmlns:r="http://schemas.openxmlformats.org/officeDocument/2006/relationships" xmlns:wp14="http://schemas.microsoft.com/office/word/2010/wordprocessingDrawing" xmlns:wp="http://schemas.openxmlformats.org/drawingml/2006/wordprocessingDrawing" xmlns:wpg="http://schemas.microsoft.com/office/word/2010/wordprocessingGroup" xmlns:wpi="http://schemas.microsoft.com/office/word/2010/wordprocessingInk" xmlns:wps="http://schemas.microsoft.com/office/word/2010/wordprocessingShape" xmlns:o="urn:schemas-microsoft-com:office:office" xmlns:v="urn:schemas-microsoft-com:vml" xmlns:w10="urn:schemas-microsoft-com:office:word" xmlns:w="http://schemas.openxmlformats.org/wordprocessingml/2006/main" xmlns:w14="http://schemas.microsoft.com/office/word/2010/wordml" xmlns:w15="http://schemas.microsoft.com/office/word/2012/wordml" xmlns:w16cex="http://schemas.microsoft.com/office/word/2018/wordml/cex" xmlns:w16cid="http://schemas.microsoft.com/office/word/2016/wordml/cid" xmlns:w16="http://schemas.microsoft.com/office/word/2018/wordml" xmlns:w16sdtdh="http://schemas.microsoft.com/office/word/2020/wordml/sdtdatahash" xmlns:w16sdtfl="http://schemas.microsoft.com/office/word/2024/wordml/sdtformatlock" xmlns:w16se="http://schemas.microsoft.com/office/word/2015/wordml/symex" xmlns:w16du="http://schemas.microsoft.com/office/word/2023/wordml/word16du" xmlns:wne="http://schemas.microsoft.com/office/word/2006/wordml" mc:Ignorable="w14 w15 w16se w16cid w16 w16cex w16sdtdh w16sdtfl w16du wp14">
   <w:sdt>
     <w:sdtPr>
       <w:id w:val="829449974"/>
@@ -2555,7 +2417,7 @@
 </file>
 
 <file path=word/footnotes.xml><?xml version="1.0" encoding="utf-8"?>
-<w:footnotes xmlns:wpc="http://schemas.microsoft.com/office/word/2010/wordprocessingCanvas" xmlns:cx="http://schemas.microsoft.com/office/drawing/2014/chartex" xmlns:cx1="http://schemas.microsoft.com/office/drawing/2015/9/8/chartex" xmlns:cx2="http://schemas.microsoft.com/office/drawing/2015/10/21/chartex" xmlns:cx3="http://schemas.microsoft.com/office/drawing/2016/5/9/chartex" xmlns:cx4="http://schemas.microsoft.com/office/drawing/2016/5/10/chartex" xmlns:cx5="http://schemas.microsoft.com/office/drawing/2016/5/11/chartex" xmlns:cx6="http://schemas.microsoft.com/office/drawing/2016/5/12/chartex" xmlns:cx7="http://schemas.microsoft.com/office/drawing/2016/5/13/chartex" xmlns:cx8="http://schemas.microsoft.com/office/drawing/2016/5/14/chartex" xmlns:mc="http://schemas.openxmlformats.org/markup-compatibility/2006" xmlns:aink="http://schemas.microsoft.com/office/drawing/2016/ink" xmlns:am3d="http://schemas.microsoft.com/office/drawing/2017/model3d" xmlns:o="urn:schemas-microsoft-com:office:office" xmlns:oel="http://schemas.microsoft.com/office/2019/extlst" xmlns:r="http://schemas.openxmlformats.org/officeDocument/2006/relationships" xmlns:m="http://schemas.openxmlformats.org/officeDocument/2006/math" xmlns:v="urn:schemas-microsoft-com:vml" xmlns:wp14="http://schemas.microsoft.com/office/word/2010/wordprocessingDrawing" xmlns:wp="http://schemas.openxmlformats.org/drawingml/2006/wordprocessingDrawing" xmlns:w10="urn:schemas-microsoft-com:office:word" xmlns:w="http://schemas.openxmlformats.org/wordprocessingml/2006/main" xmlns:w14="http://schemas.microsoft.com/office/word/2010/wordml" xmlns:w15="http://schemas.microsoft.com/office/word/2012/wordml" xmlns:w16cex="http://schemas.microsoft.com/office/word/2018/wordml/cex" xmlns:w16cid="http://schemas.microsoft.com/office/word/2016/wordml/cid" xmlns:w16="http://schemas.microsoft.com/office/word/2018/wordml" xmlns:w16du="http://schemas.microsoft.com/office/word/2023/wordml/word16du" xmlns:w16sdtdh="http://schemas.microsoft.com/office/word/2020/wordml/sdtdatahash" xmlns:w16sdtfl="http://schemas.microsoft.com/office/word/2024/wordml/sdtformatlock" xmlns:w16se="http://schemas.microsoft.com/office/word/2015/wordml/symex" xmlns:wpg="http://schemas.microsoft.com/office/word/2010/wordprocessingGroup" xmlns:wpi="http://schemas.microsoft.com/office/word/2010/wordprocessingInk" xmlns:wne="http://schemas.microsoft.com/office/word/2006/wordml" xmlns:wps="http://schemas.microsoft.com/office/word/2010/wordprocessingShape" mc:Ignorable="w14 w15 w16se w16cid w16 w16cex w16sdtdh w16sdtfl w16du wp14">
+<w:footnotes xmlns:wpc="http://schemas.microsoft.com/office/word/2010/wordprocessingCanvas" xmlns:cx="http://schemas.microsoft.com/office/drawing/2014/chartex" xmlns:cx1="http://schemas.microsoft.com/office/drawing/2015/9/8/chartex" xmlns:cx2="http://schemas.microsoft.com/office/drawing/2015/10/21/chartex" xmlns:cx3="http://schemas.microsoft.com/office/drawing/2016/5/9/chartex" xmlns:cx4="http://schemas.microsoft.com/office/drawing/2016/5/10/chartex" xmlns:cx5="http://schemas.microsoft.com/office/drawing/2016/5/11/chartex" xmlns:cx6="http://schemas.microsoft.com/office/drawing/2016/5/12/chartex" xmlns:cx7="http://schemas.microsoft.com/office/drawing/2016/5/13/chartex" xmlns:cx8="http://schemas.microsoft.com/office/drawing/2016/5/14/chartex" xmlns:mc="http://schemas.openxmlformats.org/markup-compatibility/2006" xmlns:m="http://schemas.openxmlformats.org/officeDocument/2006/math" xmlns:aink="http://schemas.microsoft.com/office/drawing/2016/ink" xmlns:am3d="http://schemas.microsoft.com/office/drawing/2017/model3d" xmlns:oel="http://schemas.microsoft.com/office/2019/extlst" xmlns:r="http://schemas.openxmlformats.org/officeDocument/2006/relationships" xmlns:wp14="http://schemas.microsoft.com/office/word/2010/wordprocessingDrawing" xmlns:wp="http://schemas.openxmlformats.org/drawingml/2006/wordprocessingDrawing" xmlns:wpg="http://schemas.microsoft.com/office/word/2010/wordprocessingGroup" xmlns:wpi="http://schemas.microsoft.com/office/word/2010/wordprocessingInk" xmlns:wps="http://schemas.microsoft.com/office/word/2010/wordprocessingShape" xmlns:o="urn:schemas-microsoft-com:office:office" xmlns:v="urn:schemas-microsoft-com:vml" xmlns:w10="urn:schemas-microsoft-com:office:word" xmlns:w="http://schemas.openxmlformats.org/wordprocessingml/2006/main" xmlns:w14="http://schemas.microsoft.com/office/word/2010/wordml" xmlns:w15="http://schemas.microsoft.com/office/word/2012/wordml" xmlns:w16cex="http://schemas.microsoft.com/office/word/2018/wordml/cex" xmlns:w16cid="http://schemas.microsoft.com/office/word/2016/wordml/cid" xmlns:w16="http://schemas.microsoft.com/office/word/2018/wordml" xmlns:w16sdtdh="http://schemas.microsoft.com/office/word/2020/wordml/sdtdatahash" xmlns:w16sdtfl="http://schemas.microsoft.com/office/word/2024/wordml/sdtformatlock" xmlns:w16se="http://schemas.microsoft.com/office/word/2015/wordml/symex" xmlns:w16du="http://schemas.microsoft.com/office/word/2023/wordml/word16du" xmlns:wne="http://schemas.microsoft.com/office/word/2006/wordml" mc:Ignorable="w14 w15 w16se w16cid w16 w16cex w16sdtdh w16sdtfl w16du wp14">
   <w:footnote w:type="separator" w:id="-1">
     <w:p>
       <w:r>
@@ -2574,7 +2436,7 @@
 </file>
 
 <file path=word/numbering.xml><?xml version="1.0" encoding="utf-8"?>
-<w:numbering xmlns:wpc="http://schemas.microsoft.com/office/word/2010/wordprocessingCanvas" xmlns:cx="http://schemas.microsoft.com/office/drawing/2014/chartex" xmlns:cx1="http://schemas.microsoft.com/office/drawing/2015/9/8/chartex" xmlns:cx2="http://schemas.microsoft.com/office/drawing/2015/10/21/chartex" xmlns:cx3="http://schemas.microsoft.com/office/drawing/2016/5/9/chartex" xmlns:cx4="http://schemas.microsoft.com/office/drawing/2016/5/10/chartex" xmlns:cx5="http://schemas.microsoft.com/office/drawing/2016/5/11/chartex" xmlns:cx6="http://schemas.microsoft.com/office/drawing/2016/5/12/chartex" xmlns:cx7="http://schemas.microsoft.com/office/drawing/2016/5/13/chartex" xmlns:cx8="http://schemas.microsoft.com/office/drawing/2016/5/14/chartex" xmlns:mc="http://schemas.openxmlformats.org/markup-compatibility/2006" xmlns:aink="http://schemas.microsoft.com/office/drawing/2016/ink" xmlns:am3d="http://schemas.microsoft.com/office/drawing/2017/model3d" xmlns:o="urn:schemas-microsoft-com:office:office" xmlns:oel="http://schemas.microsoft.com/office/2019/extlst" xmlns:r="http://schemas.openxmlformats.org/officeDocument/2006/relationships" xmlns:m="http://schemas.openxmlformats.org/officeDocument/2006/math" xmlns:v="urn:schemas-microsoft-com:vml" xmlns:wp14="http://schemas.microsoft.com/office/word/2010/wordprocessingDrawing" xmlns:wp="http://schemas.openxmlformats.org/drawingml/2006/wordprocessingDrawing" xmlns:w10="urn:schemas-microsoft-com:office:word" xmlns:w="http://schemas.openxmlformats.org/wordprocessingml/2006/main" xmlns:w14="http://schemas.microsoft.com/office/word/2010/wordml" xmlns:w15="http://schemas.microsoft.com/office/word/2012/wordml" xmlns:w16cex="http://schemas.microsoft.com/office/word/2018/wordml/cex" xmlns:w16cid="http://schemas.microsoft.com/office/word/2016/wordml/cid" xmlns:w16="http://schemas.microsoft.com/office/word/2018/wordml" xmlns:w16du="http://schemas.microsoft.com/office/word/2023/wordml/word16du" xmlns:w16sdtdh="http://schemas.microsoft.com/office/word/2020/wordml/sdtdatahash" xmlns:w16sdtfl="http://schemas.microsoft.com/office/word/2024/wordml/sdtformatlock" xmlns:w16se="http://schemas.microsoft.com/office/word/2015/wordml/symex" xmlns:wpg="http://schemas.microsoft.com/office/word/2010/wordprocessingGroup" xmlns:wpi="http://schemas.microsoft.com/office/word/2010/wordprocessingInk" xmlns:wne="http://schemas.microsoft.com/office/word/2006/wordml" xmlns:wps="http://schemas.microsoft.com/office/word/2010/wordprocessingShape" mc:Ignorable="w14 w15 w16se w16cid w16 w16cex w16sdtdh w16sdtfl w16du wp14">
+<w:numbering xmlns:wpc="http://schemas.microsoft.com/office/word/2010/wordprocessingCanvas" xmlns:cx="http://schemas.microsoft.com/office/drawing/2014/chartex" xmlns:cx1="http://schemas.microsoft.com/office/drawing/2015/9/8/chartex" xmlns:cx2="http://schemas.microsoft.com/office/drawing/2015/10/21/chartex" xmlns:cx3="http://schemas.microsoft.com/office/drawing/2016/5/9/chartex" xmlns:cx4="http://schemas.microsoft.com/office/drawing/2016/5/10/chartex" xmlns:cx5="http://schemas.microsoft.com/office/drawing/2016/5/11/chartex" xmlns:cx6="http://schemas.microsoft.com/office/drawing/2016/5/12/chartex" xmlns:cx7="http://schemas.microsoft.com/office/drawing/2016/5/13/chartex" xmlns:cx8="http://schemas.microsoft.com/office/drawing/2016/5/14/chartex" xmlns:mc="http://schemas.openxmlformats.org/markup-compatibility/2006" xmlns:m="http://schemas.openxmlformats.org/officeDocument/2006/math" xmlns:aink="http://schemas.microsoft.com/office/drawing/2016/ink" xmlns:am3d="http://schemas.microsoft.com/office/drawing/2017/model3d" xmlns:oel="http://schemas.microsoft.com/office/2019/extlst" xmlns:r="http://schemas.openxmlformats.org/officeDocument/2006/relationships" xmlns:wp14="http://schemas.microsoft.com/office/word/2010/wordprocessingDrawing" xmlns:wp="http://schemas.openxmlformats.org/drawingml/2006/wordprocessingDrawing" xmlns:wpg="http://schemas.microsoft.com/office/word/2010/wordprocessingGroup" xmlns:wpi="http://schemas.microsoft.com/office/word/2010/wordprocessingInk" xmlns:wps="http://schemas.microsoft.com/office/word/2010/wordprocessingShape" xmlns:o="urn:schemas-microsoft-com:office:office" xmlns:v="urn:schemas-microsoft-com:vml" xmlns:w10="urn:schemas-microsoft-com:office:word" xmlns:w="http://schemas.openxmlformats.org/wordprocessingml/2006/main" xmlns:w14="http://schemas.microsoft.com/office/word/2010/wordml" xmlns:w15="http://schemas.microsoft.com/office/word/2012/wordml" xmlns:w16cex="http://schemas.microsoft.com/office/word/2018/wordml/cex" xmlns:w16cid="http://schemas.microsoft.com/office/word/2016/wordml/cid" xmlns:w16="http://schemas.microsoft.com/office/word/2018/wordml" xmlns:w16sdtdh="http://schemas.microsoft.com/office/word/2020/wordml/sdtdatahash" xmlns:w16sdtfl="http://schemas.microsoft.com/office/word/2024/wordml/sdtformatlock" xmlns:w16se="http://schemas.microsoft.com/office/word/2015/wordml/symex" xmlns:w16du="http://schemas.microsoft.com/office/word/2023/wordml/word16du" xmlns:wne="http://schemas.microsoft.com/office/word/2006/wordml" mc:Ignorable="w14 w15 w16se w16cid w16 w16cex w16sdtdh w16sdtfl w16du wp14">
   <w:abstractNum w:abstractNumId="0" w15:restartNumberingAfterBreak="0">
     <w:nsid w:val="23285CC2"/>
     <w:multiLevelType w:val="multilevel"/>
@@ -2989,16 +2851,8 @@
 </w:numbering>
 </file>
 
-<file path=word/people.xml><?xml version="1.0" encoding="utf-8"?>
-<w15:people xmlns:wpc="http://schemas.microsoft.com/office/word/2010/wordprocessingCanvas" xmlns:cx="http://schemas.microsoft.com/office/drawing/2014/chartex" xmlns:cx1="http://schemas.microsoft.com/office/drawing/2015/9/8/chartex" xmlns:cx2="http://schemas.microsoft.com/office/drawing/2015/10/21/chartex" xmlns:cx3="http://schemas.microsoft.com/office/drawing/2016/5/9/chartex" xmlns:cx4="http://schemas.microsoft.com/office/drawing/2016/5/10/chartex" xmlns:cx5="http://schemas.microsoft.com/office/drawing/2016/5/11/chartex" xmlns:cx6="http://schemas.microsoft.com/office/drawing/2016/5/12/chartex" xmlns:cx7="http://schemas.microsoft.com/office/drawing/2016/5/13/chartex" xmlns:cx8="http://schemas.microsoft.com/office/drawing/2016/5/14/chartex" xmlns:mc="http://schemas.openxmlformats.org/markup-compatibility/2006" xmlns:aink="http://schemas.microsoft.com/office/drawing/2016/ink" xmlns:am3d="http://schemas.microsoft.com/office/drawing/2017/model3d" xmlns:o="urn:schemas-microsoft-com:office:office" xmlns:oel="http://schemas.microsoft.com/office/2019/extlst" xmlns:r="http://schemas.openxmlformats.org/officeDocument/2006/relationships" xmlns:m="http://schemas.openxmlformats.org/officeDocument/2006/math" xmlns:v="urn:schemas-microsoft-com:vml" xmlns:wp14="http://schemas.microsoft.com/office/word/2010/wordprocessingDrawing" xmlns:wp="http://schemas.openxmlformats.org/drawingml/2006/wordprocessingDrawing" xmlns:w10="urn:schemas-microsoft-com:office:word" xmlns:w="http://schemas.openxmlformats.org/wordprocessingml/2006/main" xmlns:w14="http://schemas.microsoft.com/office/word/2010/wordml" xmlns:w15="http://schemas.microsoft.com/office/word/2012/wordml" xmlns:w16cex="http://schemas.microsoft.com/office/word/2018/wordml/cex" xmlns:w16cid="http://schemas.microsoft.com/office/word/2016/wordml/cid" xmlns:w16="http://schemas.microsoft.com/office/word/2018/wordml" xmlns:w16du="http://schemas.microsoft.com/office/word/2023/wordml/word16du" xmlns:w16sdtdh="http://schemas.microsoft.com/office/word/2020/wordml/sdtdatahash" xmlns:w16sdtfl="http://schemas.microsoft.com/office/word/2024/wordml/sdtformatlock" xmlns:w16se="http://schemas.microsoft.com/office/word/2015/wordml/symex" xmlns:wpg="http://schemas.microsoft.com/office/word/2010/wordprocessingGroup" xmlns:wpi="http://schemas.microsoft.com/office/word/2010/wordprocessingInk" xmlns:wne="http://schemas.microsoft.com/office/word/2006/wordml" xmlns:wps="http://schemas.microsoft.com/office/word/2010/wordprocessingShape" mc:Ignorable="w14 w15 w16se w16cid w16 w16cex w16sdtdh w16sdtfl w16du wp14">
-  <w15:person w15:author="Spencer Smith">
-    <w15:presenceInfo w15:providerId="AD" w15:userId="S::smiths@mcmaster.ca::80185a1f-9ef1-4a10-a8cf-0d62d99a8080"/>
-  </w15:person>
-</w15:people>
-</file>
-
 <file path=word/styles.xml><?xml version="1.0" encoding="utf-8"?>
-<w:styles xmlns:mc="http://schemas.openxmlformats.org/markup-compatibility/2006" xmlns:r="http://schemas.openxmlformats.org/officeDocument/2006/relationships" xmlns:w="http://schemas.openxmlformats.org/wordprocessingml/2006/main" xmlns:w14="http://schemas.microsoft.com/office/word/2010/wordml" xmlns:w15="http://schemas.microsoft.com/office/word/2012/wordml" xmlns:w16cex="http://schemas.microsoft.com/office/word/2018/wordml/cex" xmlns:w16cid="http://schemas.microsoft.com/office/word/2016/wordml/cid" xmlns:w16="http://schemas.microsoft.com/office/word/2018/wordml" xmlns:w16du="http://schemas.microsoft.com/office/word/2023/wordml/word16du" xmlns:w16sdtdh="http://schemas.microsoft.com/office/word/2020/wordml/sdtdatahash" xmlns:w16sdtfl="http://schemas.microsoft.com/office/word/2024/wordml/sdtformatlock" xmlns:w16se="http://schemas.microsoft.com/office/word/2015/wordml/symex" mc:Ignorable="w14 w15 w16se w16cid w16 w16cex w16sdtdh w16sdtfl w16du">
+<w:styles xmlns:mc="http://schemas.openxmlformats.org/markup-compatibility/2006" xmlns:r="http://schemas.openxmlformats.org/officeDocument/2006/relationships" xmlns:w="http://schemas.openxmlformats.org/wordprocessingml/2006/main" xmlns:w14="http://schemas.microsoft.com/office/word/2010/wordml" xmlns:w15="http://schemas.microsoft.com/office/word/2012/wordml" xmlns:w16cex="http://schemas.microsoft.com/office/word/2018/wordml/cex" xmlns:w16cid="http://schemas.microsoft.com/office/word/2016/wordml/cid" xmlns:w16="http://schemas.microsoft.com/office/word/2018/wordml" xmlns:w16sdtdh="http://schemas.microsoft.com/office/word/2020/wordml/sdtdatahash" xmlns:w16sdtfl="http://schemas.microsoft.com/office/word/2024/wordml/sdtformatlock" xmlns:w16se="http://schemas.microsoft.com/office/word/2015/wordml/symex" xmlns:w16du="http://schemas.microsoft.com/office/word/2023/wordml/word16du" mc:Ignorable="w14 w15 w16se w16cid w16 w16cex w16sdtdh w16sdtfl w16du">
   <w:docDefaults>
     <w:rPrDefault>
       <w:rPr>

</xml_diff>

<commit_message>
Updates for ammendment version 2
</commit_message>
<xml_diff>
--- a/StateOfPractice/MACREM-2026/SupportingDocuments/Letter-of-Information-Consent-Form2.docx
+++ b/StateOfPractice/MACREM-2026/SupportingDocuments/Letter-of-Information-Consent-Form2.docx
@@ -878,6 +878,20 @@
           <w:lang w:val="en-CA"/>
         </w:rPr>
         <w:tab/>
+      </w:r>
+      <w:r>
+        <w:rPr>
+          <w:b/>
+          <w:bCs/>
+          <w:sz w:val="20"/>
+          <w:lang w:val="en-CA"/>
+          <w:rPrChange w:id="1" w:author="Spencer Smith" w:date="2026-07-29T19:09:00Z" w16du:dateUtc="2026-07-29T23:09:00Z">
+            <w:rPr>
+              <w:sz w:val="20"/>
+              <w:lang w:val="en-CA"/>
+            </w:rPr>
+          </w:rPrChange>
+        </w:rPr>
         <w:t>Student Investigator</w:t>
       </w:r>
       <w:r>
@@ -1101,16 +1115,16 @@
         </w:rPr>
         <w:tab/>
       </w:r>
-      <w:bookmarkStart w:id="1" w:name="__DdeLink__874_9832321141"/>
-      <w:r>
-        <w:rPr>
-          <w:b/>
-          <w:sz w:val="20"/>
-          <w:lang w:val="en-CA"/>
-        </w:rPr>
-        <w:tab/>
-      </w:r>
-      <w:bookmarkEnd w:id="1"/>
+      <w:bookmarkStart w:id="2" w:name="__DdeLink__874_9832321141"/>
+      <w:r>
+        <w:rPr>
+          <w:b/>
+          <w:sz w:val="20"/>
+          <w:lang w:val="en-CA"/>
+        </w:rPr>
+        <w:tab/>
+      </w:r>
+      <w:bookmarkEnd w:id="2"/>
       <w:r>
         <w:rPr>
           <w:b/>
@@ -1285,13 +1299,62 @@
         </w:rPr>
         <w:t xml:space="preserve">Participation in this study will involve </w:t>
       </w:r>
-      <w:ins w:id="2" w:author="Spencer Smith" w:date="2026-07-17T10:02:00Z" w16du:dateUtc="2026-07-17T14:02:00Z">
+      <w:r>
+        <w:rPr>
+          <w:sz w:val="20"/>
+          <w:lang w:val="en-CA"/>
+        </w:rPr>
+        <w:t xml:space="preserve">either an online survey or </w:t>
+      </w:r>
+      <w:r>
+        <w:rPr>
+          <w:sz w:val="20"/>
+          <w:lang w:val="en-CA"/>
+        </w:rPr>
+        <w:t xml:space="preserve">a one-to-one semi-structured interview between a member of our research group and a lead developer of your software. </w:t>
+      </w:r>
+      <w:r>
+        <w:rPr>
+          <w:sz w:val="20"/>
+          <w:lang w:val="en-CA"/>
+        </w:rPr>
+        <w:t xml:space="preserve">The interview will be conducted, and audio-recorded, via Microsoft Teams and the questions will be based on a script.  </w:t>
+      </w:r>
+      <w:r>
+        <w:rPr>
+          <w:sz w:val="20"/>
+          <w:lang w:val="en-CA"/>
+        </w:rPr>
+        <w:t xml:space="preserve">The video-conference interview would include roughly 20 questions that focus on the software development process and the development group. The interview should not take longer than </w:t>
+      </w:r>
+      <w:r>
+        <w:rPr>
+          <w:sz w:val="20"/>
+          <w:lang w:val="en-CA"/>
+        </w:rPr>
+        <w:t>6</w:t>
+      </w:r>
+      <w:r>
+        <w:rPr>
+          <w:sz w:val="20"/>
+          <w:lang w:val="en-CA"/>
+        </w:rPr>
+        <w:t xml:space="preserve">0 minutes. </w:t>
+      </w:r>
+      <w:r>
+        <w:rPr>
+          <w:sz w:val="20"/>
+          <w:lang w:val="en-CA"/>
+        </w:rPr>
+        <w:t>The survey option normally takes about 30 minutes</w:t>
+      </w:r>
+      <w:ins w:id="3" w:author="Spencer Smith" w:date="2026-07-29T19:22:00Z" w16du:dateUtc="2026-07-29T23:22:00Z">
         <w:r>
           <w:rPr>
             <w:sz w:val="20"/>
             <w:lang w:val="en-CA"/>
           </w:rPr>
-          <w:t xml:space="preserve">either an online survey or </w:t>
+          <w:t xml:space="preserve"> and is conducted using Microsoft Forms</w:t>
         </w:r>
       </w:ins>
       <w:r>
@@ -1299,156 +1362,151 @@
           <w:sz w:val="20"/>
           <w:lang w:val="en-CA"/>
         </w:rPr>
-        <w:t xml:space="preserve">a one-to-one semi-structured interview between a member of our research group and a lead developer of your software. </w:t>
-      </w:r>
-      <w:r>
-        <w:rPr>
-          <w:sz w:val="20"/>
-          <w:lang w:val="en-CA"/>
-        </w:rPr>
-        <w:t xml:space="preserve">The interview will be conducted, and audio-recorded, via Microsoft Teams and the questions will be based on a script.  </w:t>
-      </w:r>
-      <w:r>
-        <w:rPr>
-          <w:sz w:val="20"/>
-          <w:lang w:val="en-CA"/>
-        </w:rPr>
-        <w:t xml:space="preserve">The video-conference interview would include roughly 20 questions that focus on the software development process and the development group. The interview should not take longer than </w:t>
-      </w:r>
-      <w:r>
-        <w:rPr>
-          <w:sz w:val="20"/>
-          <w:lang w:val="en-CA"/>
-        </w:rPr>
-        <w:t>6</w:t>
-      </w:r>
-      <w:r>
-        <w:rPr>
-          <w:sz w:val="20"/>
-          <w:lang w:val="en-CA"/>
-        </w:rPr>
-        <w:t xml:space="preserve">0 minutes. </w:t>
-      </w:r>
-      <w:ins w:id="3" w:author="Spencer Smith" w:date="2026-07-17T10:02:00Z" w16du:dateUtc="2026-07-17T14:02:00Z">
+        <w:t>.</w:t>
+      </w:r>
+    </w:p>
+    <w:p>
+      <w:pPr>
+        <w:jc w:val="center"/>
+        <w:rPr>
+          <w:sz w:val="20"/>
+          <w:lang w:val="en-CA"/>
+        </w:rPr>
+      </w:pPr>
+    </w:p>
+    <w:p>
+      <w:r>
+        <w:rPr>
+          <w:b/>
+          <w:sz w:val="20"/>
+          <w:lang w:val="en-CA"/>
+        </w:rPr>
+        <w:t xml:space="preserve">Potential Harms, Risks or Discomforts: </w:t>
+      </w:r>
+      <w:r>
+        <w:rPr>
+          <w:sz w:val="20"/>
+          <w:lang w:val="en-CA"/>
+        </w:rPr>
+        <w:t xml:space="preserve">The risks involved in participating in this study are minimal. You may feel uncomfortable or anxious if you perceive that your project is being </w:t>
+      </w:r>
+      <w:r>
+        <w:rPr>
+          <w:sz w:val="20"/>
+          <w:lang w:val="en-CA"/>
+        </w:rPr>
+        <w:t>scrutinized</w:t>
+      </w:r>
+      <w:r>
+        <w:rPr>
+          <w:sz w:val="20"/>
+          <w:lang w:val="en-CA"/>
+        </w:rPr>
+        <w:t>. Our questions will focus on your development team and the development process. The questions will not suggest that a specific course of action is better than another. The questions will focus on identifying what was done and not why it was done.</w:t>
+      </w:r>
+    </w:p>
+    <w:p>
+      <w:pPr>
+        <w:rPr>
+          <w:sz w:val="20"/>
+          <w:lang w:val="en-CA"/>
+        </w:rPr>
+      </w:pPr>
+    </w:p>
+    <w:p>
+      <w:pPr>
+        <w:rPr>
+          <w:sz w:val="20"/>
+          <w:lang w:val="en-CA"/>
+        </w:rPr>
+      </w:pPr>
+      <w:r>
+        <w:rPr>
+          <w:sz w:val="20"/>
+          <w:lang w:val="en-CA"/>
+        </w:rPr>
+        <w:t>You do not need to answer questions that you do not want to answer or that make you feel uncomfortable. I describe below the steps I am taking to protect your privacy.</w:t>
+      </w:r>
+    </w:p>
+    <w:p>
+      <w:pPr>
+        <w:rPr>
+          <w:sz w:val="20"/>
+          <w:lang w:val="en-CA"/>
+        </w:rPr>
+      </w:pPr>
+    </w:p>
+    <w:p>
+      <w:pPr>
+        <w:rPr>
+          <w:sz w:val="20"/>
+          <w:lang w:val="en-CA"/>
+        </w:rPr>
+      </w:pPr>
+      <w:r>
+        <w:rPr>
+          <w:sz w:val="20"/>
+          <w:lang w:val="en-CA"/>
+        </w:rPr>
+        <w:t xml:space="preserve">There is also a minimal risk of privacy breach </w:t>
+      </w:r>
+      <w:proofErr w:type="gramStart"/>
+      <w:r>
+        <w:rPr>
+          <w:sz w:val="20"/>
+          <w:lang w:val="en-CA"/>
+        </w:rPr>
+        <w:t>in the event that</w:t>
+      </w:r>
+      <w:proofErr w:type="gramEnd"/>
+      <w:r>
+        <w:rPr>
+          <w:sz w:val="20"/>
+          <w:lang w:val="en-CA"/>
+        </w:rPr>
+        <w:t xml:space="preserve"> someone deduces your identity from the interview </w:t>
+      </w:r>
+      <w:ins w:id="4" w:author="Spencer Smith" w:date="2026-07-29T19:03:00Z" w16du:dateUtc="2026-07-29T23:03:00Z">
         <w:r>
           <w:rPr>
             <w:sz w:val="20"/>
             <w:lang w:val="en-CA"/>
           </w:rPr>
-          <w:t xml:space="preserve">The survey option normally takes </w:t>
+          <w:t xml:space="preserve">or survey </w:t>
         </w:r>
       </w:ins>
-      <w:ins w:id="4" w:author="Spencer Smith" w:date="2026-07-17T10:03:00Z" w16du:dateUtc="2026-07-17T14:03:00Z">
+      <w:r>
+        <w:rPr>
+          <w:sz w:val="20"/>
+          <w:lang w:val="en-CA"/>
+        </w:rPr>
+        <w:t xml:space="preserve">responses, as well as data breach by virtue of the interview </w:t>
+      </w:r>
+      <w:ins w:id="5" w:author="Spencer Smith" w:date="2026-07-29T19:03:00Z" w16du:dateUtc="2026-07-29T23:03:00Z">
         <w:r>
           <w:rPr>
             <w:sz w:val="20"/>
             <w:lang w:val="en-CA"/>
           </w:rPr>
-          <w:t>about 30 minutes.</w:t>
+          <w:t xml:space="preserve">and survey </w:t>
         </w:r>
       </w:ins>
-    </w:p>
-    <w:p>
-      <w:pPr>
-        <w:jc w:val="center"/>
-        <w:rPr>
-          <w:sz w:val="20"/>
-          <w:lang w:val="en-CA"/>
-        </w:rPr>
-      </w:pPr>
-    </w:p>
-    <w:p>
-      <w:r>
-        <w:rPr>
-          <w:b/>
-          <w:sz w:val="20"/>
-          <w:lang w:val="en-CA"/>
-        </w:rPr>
-        <w:t xml:space="preserve">Potential Harms, Risks or Discomforts: </w:t>
-      </w:r>
-      <w:r>
-        <w:rPr>
-          <w:sz w:val="20"/>
-          <w:lang w:val="en-CA"/>
-        </w:rPr>
-        <w:t xml:space="preserve">The risks involved in participating in this study are minimal. You may feel uncomfortable or anxious if you perceive that your project is being </w:t>
-      </w:r>
-      <w:r>
-        <w:rPr>
-          <w:sz w:val="20"/>
-          <w:lang w:val="en-CA"/>
-        </w:rPr>
-        <w:t>scrutinized</w:t>
-      </w:r>
-      <w:r>
-        <w:rPr>
-          <w:sz w:val="20"/>
-          <w:lang w:val="en-CA"/>
-        </w:rPr>
-        <w:t>. Our questions will focus on your development team and the development process. The questions will not suggest that a specific course of action is better than another. The questions will focus on identifying what was done and not why it was done.</w:t>
-      </w:r>
-    </w:p>
-    <w:p>
-      <w:pPr>
-        <w:rPr>
-          <w:sz w:val="20"/>
-          <w:lang w:val="en-CA"/>
-        </w:rPr>
-      </w:pPr>
-    </w:p>
-    <w:p>
-      <w:pPr>
-        <w:rPr>
-          <w:sz w:val="20"/>
-          <w:lang w:val="en-CA"/>
-        </w:rPr>
-      </w:pPr>
-      <w:r>
-        <w:rPr>
-          <w:sz w:val="20"/>
-          <w:lang w:val="en-CA"/>
-        </w:rPr>
-        <w:t>You do not need to answer questions that you do not want to answer or that make you feel uncomfortable. I describe below the steps I am taking to protect your privacy.</w:t>
-      </w:r>
-    </w:p>
-    <w:p>
-      <w:pPr>
-        <w:rPr>
-          <w:sz w:val="20"/>
-          <w:lang w:val="en-CA"/>
-        </w:rPr>
-      </w:pPr>
-    </w:p>
-    <w:p>
-      <w:pPr>
-        <w:rPr>
-          <w:sz w:val="20"/>
-          <w:lang w:val="en-CA"/>
-        </w:rPr>
-      </w:pPr>
-      <w:r>
-        <w:rPr>
-          <w:sz w:val="20"/>
-          <w:lang w:val="en-CA"/>
-        </w:rPr>
-        <w:t xml:space="preserve">There is also a minimal risk of privacy breach </w:t>
-      </w:r>
-      <w:proofErr w:type="gramStart"/>
-      <w:r>
-        <w:rPr>
-          <w:sz w:val="20"/>
-          <w:lang w:val="en-CA"/>
-        </w:rPr>
-        <w:t>in the event that</w:t>
-      </w:r>
-      <w:proofErr w:type="gramEnd"/>
-      <w:r>
-        <w:rPr>
-          <w:sz w:val="20"/>
-          <w:lang w:val="en-CA"/>
-        </w:rPr>
-        <w:t xml:space="preserve"> someone deduces your identity from the interview responses, as well as data breach by virtue of the interview being conducted online and the answers being stored on an online repository. The privacy breach risk will be minimized by keeping your name confidential. Your name will never be shared outside of the research team. The data breach risk will be minimized by storing interviewee names and answers separately, and by gathering and storing all data on private password protected McMaster University systems.</w:t>
-      </w:r>
+      <w:r>
+        <w:rPr>
+          <w:sz w:val="20"/>
+          <w:lang w:val="en-CA"/>
+        </w:rPr>
+        <w:t>being conducted online and the answers being stored on an online repository. The privacy breach risk will be minimized by keeping your name confidential. Your name will never be shared outside of the research team. The data breach risk will be minimized by storing interviewee names and answers separately, and by gathering and storing all data on private password protected McMaster University systems.</w:t>
+      </w:r>
+      <w:ins w:id="6" w:author="Spencer Smith" w:date="2026-07-29T19:23:00Z" w16du:dateUtc="2026-07-29T23:23:00Z">
+        <w:r>
+          <w:rPr>
+            <w:sz w:val="20"/>
+            <w:lang w:val="en-CA"/>
+          </w:rPr>
+          <w:t xml:space="preserve"> The names of survey participants will not be stored.</w:t>
+        </w:r>
+      </w:ins>
     </w:p>
     <w:p>
       <w:pPr>
@@ -1487,173 +1545,288 @@
           <w:shd w:val="clear" w:color="auto" w:fill="CCCCCC"/>
           <w:lang w:val="en-CA"/>
         </w:rPr>
-        <w:t xml:space="preserve"> identities can be inferred. The interviewee will have to accept this risk if they choose to be interviewed. </w:t>
-      </w:r>
-    </w:p>
-    <w:p>
-      <w:pPr>
-        <w:rPr>
-          <w:sz w:val="20"/>
-          <w:lang w:val="en-CA"/>
-        </w:rPr>
-      </w:pPr>
-    </w:p>
-    <w:p>
-      <w:r>
-        <w:rPr>
-          <w:b/>
-          <w:sz w:val="20"/>
-          <w:lang w:val="en-CA"/>
-        </w:rPr>
-        <w:t xml:space="preserve">Potential Benefits: </w:t>
-      </w:r>
-      <w:r>
-        <w:rPr>
-          <w:sz w:val="20"/>
-          <w:lang w:val="en-CA"/>
-        </w:rPr>
-        <w:t xml:space="preserve">The answers to these interview questions will help us analyze the current state of practice of software </w:t>
-      </w:r>
-      <w:proofErr w:type="gramStart"/>
-      <w:r>
-        <w:rPr>
-          <w:sz w:val="20"/>
-          <w:lang w:val="en-CA"/>
-        </w:rPr>
-        <w:t>development, and</w:t>
-      </w:r>
-      <w:proofErr w:type="gramEnd"/>
-      <w:r>
-        <w:rPr>
-          <w:sz w:val="20"/>
-          <w:lang w:val="en-CA"/>
-        </w:rPr>
-        <w:t xml:space="preserve"> provide insight into common or best practices for the benefit of future software development. </w:t>
-      </w:r>
-      <w:r>
-        <w:rPr>
-          <w:sz w:val="20"/>
-          <w:shd w:val="clear" w:color="auto" w:fill="CCCCCC"/>
-          <w:lang w:val="en-CA"/>
-        </w:rPr>
-        <w:t>However, participants may not benefit from participating in the study.</w:t>
-      </w:r>
-    </w:p>
-    <w:p>
-      <w:pPr>
-        <w:jc w:val="center"/>
-        <w:rPr>
-          <w:i/>
-          <w:sz w:val="20"/>
-          <w:lang w:val="en-CA"/>
-        </w:rPr>
-      </w:pPr>
-    </w:p>
-    <w:p>
-      <w:r>
-        <w:rPr>
-          <w:b/>
-          <w:sz w:val="20"/>
-          <w:lang w:val="en-CA"/>
-        </w:rPr>
-        <w:t xml:space="preserve">Confidentiality: </w:t>
-      </w:r>
-      <w:r>
-        <w:rPr>
-          <w:sz w:val="20"/>
-          <w:lang w:val="en-CA"/>
-        </w:rPr>
-        <w:t xml:space="preserve">You are participating in this study confidentially. Social risks surrounding identifiability are addressed in detail in the section of this document titled ‘Potential Harms, Risks or Discomforts’. I </w:t>
-      </w:r>
-      <w:r>
-        <w:rPr>
-          <w:sz w:val="20"/>
-          <w:szCs w:val="20"/>
-          <w:lang w:val="en-CA"/>
-        </w:rPr>
-        <w:t xml:space="preserve">will not publish your name. The data that will be collected will be stored separately from your identity. The data from all interviewees will be analyzed prior to the release of our study. We are planning on linking interview details to the software, and not to a developer. The raw data will be deleted after a retaining period of 3 years. </w:t>
-      </w:r>
-    </w:p>
-    <w:p>
-      <w:pPr>
-        <w:rPr>
-          <w:sz w:val="20"/>
-          <w:szCs w:val="20"/>
-          <w:lang w:val="en-CA"/>
-        </w:rPr>
-      </w:pPr>
-    </w:p>
-    <w:p>
-      <w:r>
-        <w:rPr>
-          <w:sz w:val="20"/>
-          <w:szCs w:val="20"/>
-          <w:lang w:val="en-CA"/>
-        </w:rPr>
-        <w:t>This study will use the Microsoft Teams platform to collect data, which is externally hosted cloud-based service. Please note that whilst this service is approved for collecting data in this study by the McMaster Research Ethics Board, there is a small risk with any platform such as this of data that is collected on external servers falling outside the control of the research team. If you are concerned about this, we would be happy to make alternative arrangements for you to participate, perhaps via telephone. Please talk to the researcher if you have any concerns.</w:t>
-      </w:r>
-    </w:p>
-    <w:p>
-      <w:pPr>
-        <w:rPr>
-          <w:sz w:val="20"/>
-          <w:szCs w:val="20"/>
-          <w:lang w:val="en-CA"/>
-        </w:rPr>
-      </w:pPr>
-    </w:p>
-    <w:p>
-      <w:r>
-        <w:rPr>
-          <w:b/>
-          <w:sz w:val="20"/>
-          <w:lang w:val="en-CA"/>
-        </w:rPr>
-        <w:t xml:space="preserve">Participation and Withdrawal: </w:t>
-      </w:r>
-      <w:r>
-        <w:rPr>
-          <w:sz w:val="20"/>
-          <w:lang w:val="en-CA"/>
-        </w:rPr>
-        <w:t xml:space="preserve">Your participation in this study is voluntary. </w:t>
-      </w:r>
-      <w:r>
-        <w:rPr>
-          <w:sz w:val="20"/>
-          <w:shd w:val="clear" w:color="auto" w:fill="CCCCCC"/>
-          <w:lang w:val="en-CA"/>
-        </w:rPr>
-        <w:t xml:space="preserve">If you decide to be part of the study, you </w:t>
-      </w:r>
-      <w:proofErr w:type="gramStart"/>
-      <w:r>
-        <w:rPr>
-          <w:sz w:val="20"/>
-          <w:shd w:val="clear" w:color="auto" w:fill="CCCCCC"/>
-          <w:lang w:val="en-CA"/>
-        </w:rPr>
-        <w:t>can stop (withdraw),</w:t>
-      </w:r>
-      <w:proofErr w:type="gramEnd"/>
-      <w:r>
-        <w:rPr>
-          <w:sz w:val="20"/>
-          <w:shd w:val="clear" w:color="auto" w:fill="CCCCCC"/>
-          <w:lang w:val="en-CA"/>
-        </w:rPr>
-        <w:t xml:space="preserve"> from the interview </w:t>
-      </w:r>
-      <w:ins w:id="5" w:author="Spencer Smith" w:date="2026-07-17T10:03:00Z" w16du:dateUtc="2026-07-17T14:03:00Z">
+        <w:t xml:space="preserve"> identities can be inferred</w:t>
+      </w:r>
+      <w:ins w:id="7" w:author="Spencer Smith" w:date="2026-07-29T19:04:00Z" w16du:dateUtc="2026-07-29T23:04:00Z">
         <w:r>
           <w:rPr>
             <w:sz w:val="20"/>
             <w:shd w:val="clear" w:color="auto" w:fill="CCCCCC"/>
             <w:lang w:val="en-CA"/>
           </w:rPr>
-          <w:t xml:space="preserve">or survey </w:t>
+          <w:t>, even for survey participants</w:t>
         </w:r>
       </w:ins>
+      <w:r>
+        <w:rPr>
+          <w:sz w:val="20"/>
+          <w:shd w:val="clear" w:color="auto" w:fill="CCCCCC"/>
+          <w:lang w:val="en-CA"/>
+        </w:rPr>
+        <w:t xml:space="preserve">. The interviewee </w:t>
+      </w:r>
+      <w:ins w:id="8" w:author="Spencer Smith" w:date="2026-07-29T19:04:00Z" w16du:dateUtc="2026-07-29T23:04:00Z">
+        <w:r>
+          <w:rPr>
+            <w:sz w:val="20"/>
+            <w:shd w:val="clear" w:color="auto" w:fill="CCCCCC"/>
+            <w:lang w:val="en-CA"/>
+          </w:rPr>
+          <w:t xml:space="preserve">and survey participants </w:t>
+        </w:r>
+      </w:ins>
+      <w:r>
+        <w:rPr>
+          <w:sz w:val="20"/>
+          <w:shd w:val="clear" w:color="auto" w:fill="CCCCCC"/>
+          <w:lang w:val="en-CA"/>
+        </w:rPr>
+        <w:t xml:space="preserve">will have to accept this risk if they choose to be interviewed. </w:t>
+      </w:r>
+    </w:p>
+    <w:p>
+      <w:pPr>
+        <w:rPr>
+          <w:sz w:val="20"/>
+          <w:lang w:val="en-CA"/>
+        </w:rPr>
+      </w:pPr>
+    </w:p>
+    <w:p>
+      <w:r>
+        <w:rPr>
+          <w:b/>
+          <w:sz w:val="20"/>
+          <w:lang w:val="en-CA"/>
+        </w:rPr>
+        <w:t xml:space="preserve">Potential Benefits: </w:t>
+      </w:r>
+      <w:r>
+        <w:rPr>
+          <w:sz w:val="20"/>
+          <w:lang w:val="en-CA"/>
+        </w:rPr>
+        <w:t xml:space="preserve">The answers to these interview questions will help us analyze the current state of practice of software </w:t>
+      </w:r>
+      <w:proofErr w:type="gramStart"/>
+      <w:r>
+        <w:rPr>
+          <w:sz w:val="20"/>
+          <w:lang w:val="en-CA"/>
+        </w:rPr>
+        <w:t>development, and</w:t>
+      </w:r>
+      <w:proofErr w:type="gramEnd"/>
+      <w:r>
+        <w:rPr>
+          <w:sz w:val="20"/>
+          <w:lang w:val="en-CA"/>
+        </w:rPr>
+        <w:t xml:space="preserve"> provide insight into common or best practices for the benefit of future software development. </w:t>
+      </w:r>
+      <w:r>
+        <w:rPr>
+          <w:sz w:val="20"/>
+          <w:shd w:val="clear" w:color="auto" w:fill="CCCCCC"/>
+          <w:lang w:val="en-CA"/>
+        </w:rPr>
+        <w:t>However, participants may not benefit from participating in the study.</w:t>
+      </w:r>
+    </w:p>
+    <w:p>
+      <w:pPr>
+        <w:jc w:val="center"/>
+        <w:rPr>
+          <w:i/>
+          <w:sz w:val="20"/>
+          <w:lang w:val="en-CA"/>
+        </w:rPr>
+      </w:pPr>
+    </w:p>
+    <w:p>
+      <w:r>
+        <w:rPr>
+          <w:b/>
+          <w:sz w:val="20"/>
+          <w:lang w:val="en-CA"/>
+        </w:rPr>
+        <w:t xml:space="preserve">Confidentiality: </w:t>
+      </w:r>
+      <w:r>
+        <w:rPr>
+          <w:sz w:val="20"/>
+          <w:lang w:val="en-CA"/>
+        </w:rPr>
+        <w:t xml:space="preserve">You are participating in this study confidentially. Social risks surrounding identifiability are addressed in detail in the section of this document titled ‘Potential Harms, Risks or Discomforts’. I </w:t>
+      </w:r>
+      <w:r>
+        <w:rPr>
+          <w:sz w:val="20"/>
+          <w:szCs w:val="20"/>
+          <w:lang w:val="en-CA"/>
+        </w:rPr>
+        <w:t xml:space="preserve">will not publish your name. The data that will be collected will be stored separately from your identity. The data from all interviewees </w:t>
+      </w:r>
+      <w:ins w:id="9" w:author="Spencer Smith" w:date="2026-07-29T19:24:00Z" w16du:dateUtc="2026-07-29T23:24:00Z">
+        <w:r>
+          <w:rPr>
+            <w:sz w:val="20"/>
+            <w:szCs w:val="20"/>
+            <w:lang w:val="en-CA"/>
+          </w:rPr>
+          <w:t xml:space="preserve">and survey participants </w:t>
+        </w:r>
+      </w:ins>
+      <w:r>
+        <w:rPr>
+          <w:sz w:val="20"/>
+          <w:szCs w:val="20"/>
+          <w:lang w:val="en-CA"/>
+        </w:rPr>
+        <w:t xml:space="preserve">will be analyzed prior to the release of our study. We are planning on linking interview details to the software, and not to a developer. The raw data will be deleted after a retaining period of 3 years. </w:t>
+      </w:r>
+    </w:p>
+    <w:p>
+      <w:pPr>
+        <w:rPr>
+          <w:sz w:val="20"/>
+          <w:szCs w:val="20"/>
+          <w:lang w:val="en-CA"/>
+        </w:rPr>
+      </w:pPr>
+    </w:p>
+    <w:p>
+      <w:r>
+        <w:rPr>
+          <w:sz w:val="20"/>
+          <w:szCs w:val="20"/>
+          <w:lang w:val="en-CA"/>
+        </w:rPr>
+        <w:t xml:space="preserve">This study will use the Microsoft Teams </w:t>
+      </w:r>
+      <w:ins w:id="10" w:author="Spencer Smith" w:date="2026-07-29T19:05:00Z" w16du:dateUtc="2026-07-29T23:05:00Z">
+        <w:r>
+          <w:rPr>
+            <w:sz w:val="20"/>
+            <w:szCs w:val="20"/>
+            <w:lang w:val="en-CA"/>
+          </w:rPr>
+          <w:t xml:space="preserve">and Microsoft Forms </w:t>
+        </w:r>
+      </w:ins>
+      <w:r>
+        <w:rPr>
+          <w:sz w:val="20"/>
+          <w:szCs w:val="20"/>
+          <w:lang w:val="en-CA"/>
+        </w:rPr>
+        <w:t>platform</w:t>
+      </w:r>
+      <w:ins w:id="11" w:author="Spencer Smith" w:date="2026-07-29T19:05:00Z" w16du:dateUtc="2026-07-29T23:05:00Z">
+        <w:r>
+          <w:rPr>
+            <w:sz w:val="20"/>
+            <w:szCs w:val="20"/>
+            <w:lang w:val="en-CA"/>
+          </w:rPr>
+          <w:t xml:space="preserve">s </w:t>
+        </w:r>
+      </w:ins>
+      <w:del w:id="12" w:author="Spencer Smith" w:date="2026-07-29T19:05:00Z" w16du:dateUtc="2026-07-29T23:05:00Z">
+        <w:r>
+          <w:rPr>
+            <w:sz w:val="20"/>
+            <w:szCs w:val="20"/>
+            <w:lang w:val="en-CA"/>
+          </w:rPr>
+          <w:delText xml:space="preserve"> </w:delText>
+        </w:r>
+      </w:del>
+      <w:r>
+        <w:rPr>
+          <w:sz w:val="20"/>
+          <w:szCs w:val="20"/>
+          <w:lang w:val="en-CA"/>
+        </w:rPr>
+        <w:t xml:space="preserve">to collect data, which </w:t>
+      </w:r>
+      <w:ins w:id="13" w:author="Spencer Smith" w:date="2026-07-29T19:05:00Z" w16du:dateUtc="2026-07-29T23:05:00Z">
+        <w:r>
+          <w:rPr>
+            <w:sz w:val="20"/>
+            <w:szCs w:val="20"/>
+            <w:lang w:val="en-CA"/>
+          </w:rPr>
+          <w:t>are</w:t>
+        </w:r>
+      </w:ins>
+      <w:del w:id="14" w:author="Spencer Smith" w:date="2026-07-29T19:05:00Z" w16du:dateUtc="2026-07-29T23:05:00Z">
+        <w:r>
+          <w:rPr>
+            <w:sz w:val="20"/>
+            <w:szCs w:val="20"/>
+            <w:lang w:val="en-CA"/>
+          </w:rPr>
+          <w:delText>is</w:delText>
+        </w:r>
+      </w:del>
+      <w:r>
+        <w:rPr>
+          <w:sz w:val="20"/>
+          <w:szCs w:val="20"/>
+          <w:lang w:val="en-CA"/>
+        </w:rPr>
+        <w:t xml:space="preserve"> externally hosted cloud-based service. Please note that whilst this service is approved for collecting data in this study by the McMaster Research Ethics Board, there is a small risk with any platform such as this of data that is collected on external servers falling outside the control of the research team. If you are concerned about this, we would be happy to make alternative arrangements for you to participate, perhaps via telephone. Please talk to the researcher if you have any concerns.</w:t>
+      </w:r>
+    </w:p>
+    <w:p>
+      <w:pPr>
+        <w:rPr>
+          <w:sz w:val="20"/>
+          <w:szCs w:val="20"/>
+          <w:lang w:val="en-CA"/>
+        </w:rPr>
+      </w:pPr>
+    </w:p>
+    <w:p>
+      <w:pPr>
+        <w:rPr>
+          <w:ins w:id="15" w:author="Spencer Smith" w:date="2026-07-29T19:11:00Z" w16du:dateUtc="2026-07-29T23:11:00Z"/>
+          <w:sz w:val="20"/>
+          <w:lang w:val="en-CA"/>
+        </w:rPr>
+      </w:pPr>
+      <w:r>
+        <w:rPr>
+          <w:b/>
+          <w:sz w:val="20"/>
+          <w:lang w:val="en-CA"/>
+        </w:rPr>
+        <w:t xml:space="preserve">Participation and Withdrawal: </w:t>
+      </w:r>
+      <w:r>
+        <w:rPr>
+          <w:sz w:val="20"/>
+          <w:lang w:val="en-CA"/>
+        </w:rPr>
+        <w:t xml:space="preserve">Your participation in this study is voluntary. </w:t>
+      </w:r>
+      <w:r>
+        <w:rPr>
+          <w:sz w:val="20"/>
+          <w:shd w:val="clear" w:color="auto" w:fill="CCCCCC"/>
+          <w:lang w:val="en-CA"/>
+        </w:rPr>
+        <w:t xml:space="preserve">If you decide to be part of the study, you can stop (withdraw), from the interview </w:t>
+      </w:r>
+      <w:r>
+        <w:rPr>
+          <w:sz w:val="20"/>
+          <w:shd w:val="clear" w:color="auto" w:fill="CCCCCC"/>
+          <w:lang w:val="en-CA"/>
+        </w:rPr>
+        <w:t xml:space="preserve">or survey </w:t>
+      </w:r>
       <w:r>
         <w:rPr>
           <w:sz w:val="20"/>
@@ -1689,7 +1862,17 @@
         </w:rPr>
         <w:t xml:space="preserve"> or up until </w:t>
       </w:r>
-      <w:del w:id="6" w:author="Spencer Smith" w:date="2026-07-17T10:03:00Z" w16du:dateUtc="2026-07-17T14:03:00Z">
+      <w:r>
+        <w:rPr>
+          <w:color w:val="000000"/>
+          <w:sz w:val="20"/>
+          <w:szCs w:val="20"/>
+          <w:shd w:val="clear" w:color="auto" w:fill="CCCCCC"/>
+          <w:lang w:val="en-CA"/>
+        </w:rPr>
+        <w:t xml:space="preserve">August </w:t>
+      </w:r>
+      <w:ins w:id="16" w:author="Spencer Smith" w:date="2026-07-29T19:07:00Z" w16du:dateUtc="2026-07-29T23:07:00Z">
         <w:r>
           <w:rPr>
             <w:color w:val="000000"/>
@@ -1698,8 +1881,10 @@
             <w:shd w:val="clear" w:color="auto" w:fill="CCCCCC"/>
             <w:lang w:val="en-CA"/>
           </w:rPr>
-          <w:delText>July</w:delText>
-        </w:r>
+          <w:t>30</w:t>
+        </w:r>
+      </w:ins>
+      <w:del w:id="17" w:author="Spencer Smith" w:date="2026-07-29T19:07:00Z" w16du:dateUtc="2026-07-29T23:07:00Z">
         <w:r>
           <w:rPr>
             <w:color w:val="000000"/>
@@ -1708,82 +1893,19 @@
             <w:shd w:val="clear" w:color="auto" w:fill="CCCCCC"/>
             <w:lang w:val="en-CA"/>
           </w:rPr>
-          <w:delText xml:space="preserve"> 31</w:delText>
-        </w:r>
-        <w:r>
-          <w:rPr>
-            <w:color w:val="000000"/>
-            <w:sz w:val="20"/>
-            <w:szCs w:val="20"/>
-            <w:shd w:val="clear" w:color="auto" w:fill="CCCCCC"/>
-            <w:vertAlign w:val="superscript"/>
-            <w:lang w:val="en-CA"/>
-          </w:rPr>
-          <w:delText>st</w:delText>
-        </w:r>
-        <w:r>
-          <w:rPr>
-            <w:color w:val="000000"/>
-            <w:sz w:val="20"/>
-            <w:szCs w:val="20"/>
-            <w:shd w:val="clear" w:color="auto" w:fill="CCCCCC"/>
-            <w:lang w:val="en-CA"/>
-          </w:rPr>
-          <w:delText xml:space="preserve"> </w:delText>
+          <w:delText>8</w:delText>
         </w:r>
       </w:del>
-      <w:ins w:id="7" w:author="Spencer Smith" w:date="2026-07-17T10:03:00Z" w16du:dateUtc="2026-07-17T14:03:00Z">
-        <w:r>
-          <w:rPr>
-            <w:color w:val="000000"/>
-            <w:sz w:val="20"/>
-            <w:szCs w:val="20"/>
-            <w:shd w:val="clear" w:color="auto" w:fill="CCCCCC"/>
-            <w:lang w:val="en-CA"/>
-          </w:rPr>
-          <w:t>August 8</w:t>
-        </w:r>
-        <w:r>
-          <w:rPr>
-            <w:color w:val="000000"/>
-            <w:sz w:val="20"/>
-            <w:szCs w:val="20"/>
-            <w:shd w:val="clear" w:color="auto" w:fill="CCCCCC"/>
-            <w:vertAlign w:val="superscript"/>
-            <w:lang w:val="en-CA"/>
-            <w:rPrChange w:id="8" w:author="Spencer Smith" w:date="2026-07-17T10:03:00Z" w16du:dateUtc="2026-07-17T14:03:00Z">
-              <w:rPr>
-                <w:color w:val="000000"/>
-                <w:sz w:val="20"/>
-                <w:szCs w:val="20"/>
-                <w:shd w:val="clear" w:color="auto" w:fill="CCCCCC"/>
-                <w:lang w:val="en-CA"/>
-              </w:rPr>
-            </w:rPrChange>
-          </w:rPr>
-          <w:t>th</w:t>
-        </w:r>
-        <w:r>
-          <w:rPr>
-            <w:color w:val="000000"/>
-            <w:sz w:val="20"/>
-            <w:szCs w:val="20"/>
-            <w:shd w:val="clear" w:color="auto" w:fill="CCCCCC"/>
-            <w:lang w:val="en-CA"/>
-          </w:rPr>
-          <w:t xml:space="preserve">, </w:t>
-        </w:r>
-      </w:ins>
-      <w:proofErr w:type="gramStart"/>
       <w:r>
         <w:rPr>
           <w:color w:val="000000"/>
           <w:sz w:val="20"/>
           <w:szCs w:val="20"/>
           <w:shd w:val="clear" w:color="auto" w:fill="CCCCCC"/>
-          <w:lang w:val="en-CA"/>
-        </w:rPr>
-        <w:t>202</w:t>
+          <w:vertAlign w:val="superscript"/>
+          <w:lang w:val="en-CA"/>
+        </w:rPr>
+        <w:t>th</w:t>
       </w:r>
       <w:r>
         <w:rPr>
@@ -1793,9 +1915,8 @@
           <w:shd w:val="clear" w:color="auto" w:fill="CCCCCC"/>
           <w:lang w:val="en-CA"/>
         </w:rPr>
-        <w:t>6</w:t>
-      </w:r>
-      <w:proofErr w:type="gramEnd"/>
+        <w:t xml:space="preserve">, </w:t>
+      </w:r>
       <w:r>
         <w:rPr>
           <w:color w:val="000000"/>
@@ -1804,223 +1925,348 @@
           <w:shd w:val="clear" w:color="auto" w:fill="CCCCCC"/>
           <w:lang w:val="en-CA"/>
         </w:rPr>
+        <w:t>202</w:t>
+      </w:r>
+      <w:r>
+        <w:rPr>
+          <w:color w:val="000000"/>
+          <w:sz w:val="20"/>
+          <w:szCs w:val="20"/>
+          <w:shd w:val="clear" w:color="auto" w:fill="CCCCCC"/>
+          <w:lang w:val="en-CA"/>
+        </w:rPr>
+        <w:t xml:space="preserve">6 </w:t>
+      </w:r>
+      <w:r>
+        <w:rPr>
+          <w:sz w:val="20"/>
+          <w:shd w:val="clear" w:color="auto" w:fill="CCCCCC"/>
+          <w:lang w:val="en-CA"/>
+        </w:rPr>
+        <w:t xml:space="preserve">when we expect to be </w:t>
+      </w:r>
+      <w:r>
+        <w:rPr>
+          <w:color w:val="000000"/>
+          <w:sz w:val="20"/>
+          <w:shd w:val="clear" w:color="auto" w:fill="CCCCCC"/>
+          <w:lang w:val="en-CA"/>
+        </w:rPr>
+        <w:t>analyzing</w:t>
+      </w:r>
+      <w:r>
+        <w:rPr>
+          <w:sz w:val="20"/>
+          <w:shd w:val="clear" w:color="auto" w:fill="CCCCCC"/>
+          <w:lang w:val="en-CA"/>
+        </w:rPr>
+        <w:t xml:space="preserve"> the data into our report.</w:t>
+      </w:r>
+      <w:r>
+        <w:rPr>
+          <w:sz w:val="20"/>
+          <w:lang w:val="en-CA"/>
+        </w:rPr>
+        <w:t xml:space="preserve"> If you decide to withdraw, there will be no consequences to you. You can request for your data to be removed via email. </w:t>
+      </w:r>
+      <w:ins w:id="18" w:author="Spencer Smith" w:date="2026-07-29T19:25:00Z" w16du:dateUtc="2026-07-29T23:25:00Z">
+        <w:r>
+          <w:rPr>
+            <w:sz w:val="20"/>
+            <w:lang w:val="en-CA"/>
+          </w:rPr>
+          <w:t>Since data on the survey participant’s names are not collected, survey participants who wish to withdraw will need to let the principal investigator or one of the student investigators know the software project for which answers were provided</w:t>
+        </w:r>
+      </w:ins>
+      <w:ins w:id="19" w:author="Spencer Smith" w:date="2026-07-29T19:26:00Z" w16du:dateUtc="2026-07-29T23:26:00Z">
+        <w:r>
+          <w:rPr>
+            <w:sz w:val="20"/>
+            <w:lang w:val="en-CA"/>
+          </w:rPr>
+          <w:t xml:space="preserve">. </w:t>
+        </w:r>
+      </w:ins>
+      <w:ins w:id="20" w:author="Spencer Smith" w:date="2026-07-29T19:25:00Z" w16du:dateUtc="2026-07-29T23:25:00Z">
+        <w:r>
+          <w:rPr>
+            <w:sz w:val="20"/>
+            <w:lang w:val="en-CA"/>
+          </w:rPr>
+          <w:t xml:space="preserve"> </w:t>
+        </w:r>
+      </w:ins>
+      <w:r>
+        <w:rPr>
+          <w:sz w:val="20"/>
+          <w:lang w:val="en-CA"/>
+        </w:rPr>
+        <w:t xml:space="preserve">In cases of withdrawal prior to </w:t>
+      </w:r>
+      <w:r>
+        <w:rPr>
+          <w:sz w:val="20"/>
+          <w:lang w:val="en-CA"/>
+        </w:rPr>
+        <w:t xml:space="preserve">August </w:t>
+      </w:r>
+      <w:ins w:id="21" w:author="Spencer Smith" w:date="2026-07-29T19:07:00Z" w16du:dateUtc="2026-07-29T23:07:00Z">
+        <w:r>
+          <w:rPr>
+            <w:sz w:val="20"/>
+            <w:lang w:val="en-CA"/>
+          </w:rPr>
+          <w:t>30</w:t>
+        </w:r>
+      </w:ins>
+      <w:del w:id="22" w:author="Spencer Smith" w:date="2026-07-29T19:07:00Z" w16du:dateUtc="2026-07-29T23:07:00Z">
+        <w:r>
+          <w:rPr>
+            <w:sz w:val="20"/>
+            <w:lang w:val="en-CA"/>
+          </w:rPr>
+          <w:delText>8</w:delText>
+        </w:r>
+      </w:del>
+      <w:r>
+        <w:rPr>
+          <w:sz w:val="20"/>
+          <w:lang w:val="en-CA"/>
+        </w:rPr>
+        <w:t xml:space="preserve">th, </w:t>
+      </w:r>
+      <w:r>
+        <w:rPr>
+          <w:sz w:val="20"/>
+          <w:lang w:val="en-CA"/>
+        </w:rPr>
+        <w:t>202</w:t>
+      </w:r>
+      <w:r>
+        <w:rPr>
+          <w:sz w:val="20"/>
+          <w:lang w:val="en-CA"/>
+        </w:rPr>
+        <w:t>6</w:t>
+      </w:r>
+      <w:r>
+        <w:rPr>
+          <w:sz w:val="20"/>
+          <w:lang w:val="en-CA"/>
+        </w:rPr>
+        <w:t xml:space="preserve"> any data that you have provided will be destroyed unless you indicate otherwise.</w:t>
+      </w:r>
+      <w:del w:id="23" w:author="Spencer Smith" w:date="2026-07-29T19:26:00Z" w16du:dateUtc="2026-07-29T23:26:00Z">
+        <w:r>
+          <w:rPr>
+            <w:sz w:val="20"/>
+            <w:lang w:val="en-CA"/>
+          </w:rPr>
+          <w:delText xml:space="preserve">  </w:delText>
+        </w:r>
+      </w:del>
+    </w:p>
+    <w:p>
+      <w:pPr>
+        <w:rPr>
+          <w:ins w:id="24" w:author="Spencer Smith" w:date="2026-07-29T19:11:00Z" w16du:dateUtc="2026-07-29T23:11:00Z"/>
+          <w:sz w:val="20"/>
+          <w:lang w:val="en-CA"/>
+        </w:rPr>
+      </w:pPr>
+    </w:p>
+    <w:p>
+      <w:ins w:id="25" w:author="Spencer Smith" w:date="2026-07-29T19:11:00Z" w16du:dateUtc="2026-07-29T23:11:00Z">
+        <w:r>
+          <w:rPr>
+            <w:sz w:val="20"/>
+            <w:lang w:val="en-CA"/>
+          </w:rPr>
+          <w:t>For the interview and for the survey, i</w:t>
+        </w:r>
+      </w:ins>
+      <w:del w:id="26" w:author="Spencer Smith" w:date="2026-07-29T19:11:00Z" w16du:dateUtc="2026-07-29T23:11:00Z">
+        <w:r>
+          <w:rPr>
+            <w:sz w:val="20"/>
+            <w:lang w:val="en-CA"/>
+          </w:rPr>
+          <w:delText>I</w:delText>
+        </w:r>
+      </w:del>
+      <w:r>
+        <w:rPr>
+          <w:sz w:val="20"/>
+          <w:lang w:val="en-CA"/>
+        </w:rPr>
+        <w:t>f you do not want to answer some of the questions you do not have to</w:t>
+      </w:r>
+      <w:ins w:id="27" w:author="Spencer Smith" w:date="2026-07-29T19:11:00Z" w16du:dateUtc="2026-07-29T23:11:00Z">
+        <w:r>
+          <w:rPr>
+            <w:sz w:val="20"/>
+            <w:lang w:val="en-CA"/>
+          </w:rPr>
+          <w:t xml:space="preserve">.  Partially complete interviews and surveys </w:t>
+        </w:r>
+      </w:ins>
+      <w:del w:id="28" w:author="Spencer Smith" w:date="2026-07-29T19:11:00Z" w16du:dateUtc="2026-07-29T23:11:00Z">
+        <w:r>
+          <w:rPr>
+            <w:sz w:val="20"/>
+            <w:lang w:val="en-CA"/>
+          </w:rPr>
+          <w:delText xml:space="preserve">, but you </w:delText>
+        </w:r>
+      </w:del>
+      <w:r>
+        <w:rPr>
+          <w:sz w:val="20"/>
+          <w:lang w:val="en-CA"/>
+        </w:rPr>
+        <w:t>can still be in the study.</w:t>
+      </w:r>
+      <w:r>
+        <w:rPr>
+          <w:i/>
+          <w:sz w:val="20"/>
+          <w:lang w:val="en-CA"/>
+        </w:rPr>
         <w:t xml:space="preserve"> </w:t>
       </w:r>
-      <w:r>
-        <w:rPr>
-          <w:sz w:val="20"/>
-          <w:shd w:val="clear" w:color="auto" w:fill="CCCCCC"/>
-          <w:lang w:val="en-CA"/>
-        </w:rPr>
-        <w:t xml:space="preserve">when we expect to be </w:t>
-      </w:r>
-      <w:r>
-        <w:rPr>
-          <w:color w:val="000000"/>
-          <w:sz w:val="20"/>
-          <w:shd w:val="clear" w:color="auto" w:fill="CCCCCC"/>
-          <w:lang w:val="en-CA"/>
-        </w:rPr>
-        <w:t>analyzing</w:t>
-      </w:r>
-      <w:r>
-        <w:rPr>
-          <w:sz w:val="20"/>
-          <w:shd w:val="clear" w:color="auto" w:fill="CCCCCC"/>
-          <w:lang w:val="en-CA"/>
-        </w:rPr>
-        <w:t xml:space="preserve"> the data into our report.</w:t>
-      </w:r>
-      <w:r>
-        <w:rPr>
-          <w:sz w:val="20"/>
-          <w:lang w:val="en-CA"/>
-        </w:rPr>
-        <w:t xml:space="preserve"> If you decide to withdraw, there will be no consequences to you. You can request for your data to be removed via email. In cases of withdrawal prior to </w:t>
-      </w:r>
-      <w:del w:id="9" w:author="Spencer Smith" w:date="2026-07-17T10:04:00Z" w16du:dateUtc="2026-07-17T14:04:00Z">
+    </w:p>
+    <w:p>
+      <w:pPr>
+        <w:rPr>
+          <w:b/>
+          <w:sz w:val="20"/>
+          <w:lang w:val="en-CA"/>
+        </w:rPr>
+      </w:pPr>
+    </w:p>
+    <w:p>
+      <w:r>
+        <w:rPr>
+          <w:b/>
+          <w:sz w:val="20"/>
+          <w:lang w:val="en-CA"/>
+        </w:rPr>
+        <w:t xml:space="preserve">Information about the Study Results:  </w:t>
+      </w:r>
+      <w:r>
+        <w:rPr>
+          <w:sz w:val="20"/>
+          <w:lang w:val="en-CA"/>
+        </w:rPr>
+        <w:t xml:space="preserve">We expect to have this study completed by approximately </w:t>
+      </w:r>
+      <w:r>
+        <w:rPr>
+          <w:sz w:val="20"/>
+          <w:lang w:val="en-CA"/>
+        </w:rPr>
+        <w:t xml:space="preserve">November </w:t>
+      </w:r>
+      <w:r>
+        <w:rPr>
+          <w:sz w:val="20"/>
+          <w:lang w:val="en-CA"/>
+        </w:rPr>
+        <w:t>202</w:t>
+      </w:r>
+      <w:r>
+        <w:rPr>
+          <w:sz w:val="20"/>
+          <w:lang w:val="en-CA"/>
+        </w:rPr>
+        <w:t>6</w:t>
+      </w:r>
+      <w:r>
+        <w:rPr>
+          <w:i/>
+          <w:sz w:val="20"/>
+          <w:lang w:val="en-CA"/>
+        </w:rPr>
+        <w:t>.</w:t>
+      </w:r>
+      <w:r>
+        <w:rPr>
+          <w:sz w:val="20"/>
+          <w:lang w:val="en-CA"/>
+        </w:rPr>
+        <w:t xml:space="preserve"> If you would like </w:t>
+      </w:r>
+      <w:proofErr w:type="gramStart"/>
+      <w:r>
+        <w:rPr>
+          <w:sz w:val="20"/>
+          <w:lang w:val="en-CA"/>
+        </w:rPr>
+        <w:t>a brief summary</w:t>
+      </w:r>
+      <w:proofErr w:type="gramEnd"/>
+      <w:r>
+        <w:rPr>
+          <w:sz w:val="20"/>
+          <w:lang w:val="en-CA"/>
+        </w:rPr>
+        <w:t xml:space="preserve"> of the results, please let me know how you would like it sent to you.  </w:t>
+      </w:r>
+      <w:ins w:id="29" w:author="Spencer Smith" w:date="2026-07-29T19:26:00Z" w16du:dateUtc="2026-07-29T23:26:00Z">
         <w:r>
           <w:rPr>
             <w:sz w:val="20"/>
             <w:lang w:val="en-CA"/>
           </w:rPr>
-          <w:delText>July</w:delText>
-        </w:r>
+          <w:t xml:space="preserve">Interview participants will be asked this question again during the interview </w:t>
+        </w:r>
+      </w:ins>
+      <w:ins w:id="30" w:author="Spencer Smith" w:date="2026-07-29T19:27:00Z" w16du:dateUtc="2026-07-29T23:27:00Z">
         <w:r>
           <w:rPr>
             <w:sz w:val="20"/>
             <w:lang w:val="en-CA"/>
           </w:rPr>
-          <w:delText xml:space="preserve"> </w:delText>
-        </w:r>
-      </w:del>
-      <w:ins w:id="10" w:author="Spencer Smith" w:date="2026-07-17T10:04:00Z" w16du:dateUtc="2026-07-17T14:04:00Z">
+          <w:t>and survey part</w:t>
+        </w:r>
+      </w:ins>
+      <w:ins w:id="31" w:author="Spencer Smith" w:date="2026-07-29T19:28:00Z" w16du:dateUtc="2026-07-29T23:28:00Z">
         <w:r>
           <w:rPr>
             <w:sz w:val="20"/>
             <w:lang w:val="en-CA"/>
           </w:rPr>
-          <w:t>August 8th</w:t>
+          <w:t>i</w:t>
         </w:r>
       </w:ins>
-      <w:del w:id="11" w:author="Spencer Smith" w:date="2026-07-17T10:04:00Z" w16du:dateUtc="2026-07-17T14:04:00Z">
+      <w:ins w:id="32" w:author="Spencer Smith" w:date="2026-07-29T19:27:00Z" w16du:dateUtc="2026-07-29T23:27:00Z">
         <w:r>
           <w:rPr>
             <w:sz w:val="20"/>
             <w:lang w:val="en-CA"/>
           </w:rPr>
-          <w:delText>31</w:delText>
-        </w:r>
-        <w:r>
-          <w:rPr>
-            <w:sz w:val="20"/>
-            <w:vertAlign w:val="superscript"/>
-            <w:lang w:val="en-CA"/>
-          </w:rPr>
-          <w:delText>st</w:delText>
-        </w:r>
-        <w:r>
-          <w:rPr>
-            <w:sz w:val="20"/>
-            <w:lang w:val="en-CA"/>
-          </w:rPr>
-          <w:delText xml:space="preserve"> </w:delText>
-        </w:r>
-      </w:del>
-      <w:ins w:id="12" w:author="Spencer Smith" w:date="2026-07-17T10:04:00Z" w16du:dateUtc="2026-07-17T14:04:00Z">
-        <w:r>
-          <w:rPr>
-            <w:sz w:val="20"/>
-            <w:lang w:val="en-CA"/>
-          </w:rPr>
-          <w:t xml:space="preserve">, </w:t>
+          <w:t>cipants will be given the option of providing an email address at the end of the survey.</w:t>
         </w:r>
       </w:ins>
-      <w:r>
-        <w:rPr>
-          <w:sz w:val="20"/>
-          <w:lang w:val="en-CA"/>
-        </w:rPr>
-        <w:t>202</w:t>
-      </w:r>
-      <w:r>
-        <w:rPr>
-          <w:sz w:val="20"/>
-          <w:lang w:val="en-CA"/>
-        </w:rPr>
-        <w:t>6</w:t>
-      </w:r>
-      <w:r>
-        <w:rPr>
-          <w:sz w:val="20"/>
-          <w:lang w:val="en-CA"/>
-        </w:rPr>
-        <w:t xml:space="preserve"> any data that you have provided will be destroyed unless you indicate otherwise.  If you do not want to answer some of the questions you do not have to, but you can still be in the study.</w:t>
-      </w:r>
-      <w:r>
-        <w:rPr>
+    </w:p>
+    <w:p>
+      <w:pPr>
+        <w:rPr>
+          <w:b/>
           <w:i/>
           <w:sz w:val="20"/>
           <w:lang w:val="en-CA"/>
         </w:rPr>
-        <w:t xml:space="preserve"> </w:t>
-      </w:r>
-    </w:p>
-    <w:p>
-      <w:pPr>
-        <w:rPr>
-          <w:b/>
-          <w:sz w:val="20"/>
-          <w:lang w:val="en-CA"/>
-        </w:rPr>
-      </w:pPr>
-    </w:p>
-    <w:p>
-      <w:r>
-        <w:rPr>
-          <w:b/>
-          <w:sz w:val="20"/>
-          <w:lang w:val="en-CA"/>
-        </w:rPr>
-        <w:t xml:space="preserve">Information about the Study Results:  </w:t>
-      </w:r>
-      <w:r>
-        <w:rPr>
-          <w:sz w:val="20"/>
-          <w:lang w:val="en-CA"/>
-        </w:rPr>
-        <w:t xml:space="preserve">We expect to have this study completed by approximately </w:t>
-      </w:r>
-      <w:r>
-        <w:rPr>
-          <w:sz w:val="20"/>
-          <w:lang w:val="en-CA"/>
-        </w:rPr>
-        <w:t xml:space="preserve">November </w:t>
-      </w:r>
-      <w:r>
-        <w:rPr>
-          <w:sz w:val="20"/>
-          <w:lang w:val="en-CA"/>
-        </w:rPr>
-        <w:t>202</w:t>
-      </w:r>
-      <w:r>
-        <w:rPr>
-          <w:sz w:val="20"/>
-          <w:lang w:val="en-CA"/>
-        </w:rPr>
-        <w:t>6</w:t>
-      </w:r>
-      <w:r>
-        <w:rPr>
-          <w:i/>
-          <w:sz w:val="20"/>
-          <w:lang w:val="en-CA"/>
-        </w:rPr>
-        <w:t>.</w:t>
-      </w:r>
-      <w:r>
-        <w:rPr>
-          <w:sz w:val="20"/>
-          <w:lang w:val="en-CA"/>
-        </w:rPr>
-        <w:t xml:space="preserve"> If you would like </w:t>
-      </w:r>
-      <w:proofErr w:type="gramStart"/>
-      <w:r>
-        <w:rPr>
-          <w:sz w:val="20"/>
-          <w:lang w:val="en-CA"/>
-        </w:rPr>
-        <w:t>a brief summary</w:t>
-      </w:r>
-      <w:proofErr w:type="gramEnd"/>
-      <w:r>
-        <w:rPr>
-          <w:sz w:val="20"/>
-          <w:lang w:val="en-CA"/>
-        </w:rPr>
-        <w:t xml:space="preserve"> of the results, please let me know how you would like it sent to you.  </w:t>
-      </w:r>
-    </w:p>
-    <w:p>
-      <w:pPr>
-        <w:rPr>
-          <w:b/>
-          <w:i/>
-          <w:sz w:val="20"/>
-          <w:lang w:val="en-CA"/>
-        </w:rPr>
-      </w:pPr>
-    </w:p>
-    <w:p>
-      <w:r>
-        <w:rPr>
-          <w:b/>
-          <w:sz w:val="20"/>
-          <w:lang w:val="en-CA"/>
-        </w:rPr>
+      </w:pPr>
+    </w:p>
+    <w:p>
+      <w:r>
+        <w:rPr>
+          <w:b/>
+          <w:sz w:val="20"/>
+          <w:lang w:val="en-CA"/>
+        </w:rPr>
+        <w:lastRenderedPageBreak/>
         <w:t>Questions about the Study:</w:t>
       </w:r>
       <w:r>
@@ -2188,7 +2434,16 @@
         </w:rPr>
         <w:t xml:space="preserve">If you choose to participate in this study you may withdraw from the study at any time or up until </w:t>
       </w:r>
-      <w:ins w:id="13" w:author="Spencer Smith" w:date="2026-07-17T10:04:00Z" w16du:dateUtc="2026-07-17T14:04:00Z">
+      <w:r>
+        <w:rPr>
+          <w:color w:val="000000"/>
+          <w:sz w:val="20"/>
+          <w:szCs w:val="20"/>
+          <w:lang w:val="en-CA"/>
+        </w:rPr>
+        <w:t xml:space="preserve">August </w:t>
+      </w:r>
+      <w:ins w:id="33" w:author="Spencer Smith" w:date="2026-07-29T18:45:00Z" w16du:dateUtc="2026-07-29T22:45:00Z">
         <w:r>
           <w:rPr>
             <w:color w:val="000000"/>
@@ -2196,26 +2451,10 @@
             <w:szCs w:val="20"/>
             <w:lang w:val="en-CA"/>
           </w:rPr>
-          <w:t>August 8</w:t>
-        </w:r>
-        <w:r>
-          <w:rPr>
-            <w:color w:val="000000"/>
-            <w:sz w:val="20"/>
-            <w:szCs w:val="20"/>
-            <w:vertAlign w:val="superscript"/>
-            <w:lang w:val="en-CA"/>
-            <w:rPrChange w:id="14" w:author="Spencer Smith" w:date="2026-07-17T10:04:00Z" w16du:dateUtc="2026-07-17T14:04:00Z">
-              <w:rPr>
-                <w:color w:val="000000"/>
-                <w:sz w:val="20"/>
-                <w:szCs w:val="20"/>
-                <w:lang w:val="en-CA"/>
-              </w:rPr>
-            </w:rPrChange>
-          </w:rPr>
-          <w:t>th</w:t>
-        </w:r>
+          <w:t>30</w:t>
+        </w:r>
+      </w:ins>
+      <w:del w:id="34" w:author="Spencer Smith" w:date="2026-07-29T18:45:00Z" w16du:dateUtc="2026-07-29T22:45:00Z">
         <w:r>
           <w:rPr>
             <w:color w:val="000000"/>
@@ -2223,48 +2462,28 @@
             <w:szCs w:val="20"/>
             <w:lang w:val="en-CA"/>
           </w:rPr>
-          <w:t xml:space="preserve">, </w:t>
-        </w:r>
-      </w:ins>
-      <w:del w:id="15" w:author="Spencer Smith" w:date="2026-07-17T10:04:00Z" w16du:dateUtc="2026-07-17T14:04:00Z">
-        <w:r>
-          <w:rPr>
-            <w:color w:val="000000"/>
-            <w:sz w:val="20"/>
-            <w:szCs w:val="20"/>
-            <w:lang w:val="en-CA"/>
-          </w:rPr>
-          <w:delText xml:space="preserve">July </w:delText>
-        </w:r>
-        <w:r>
-          <w:rPr>
-            <w:color w:val="000000"/>
-            <w:sz w:val="20"/>
-            <w:szCs w:val="20"/>
-            <w:lang w:val="en-CA"/>
-          </w:rPr>
-          <w:delText>31</w:delText>
-        </w:r>
-        <w:r>
-          <w:rPr>
-            <w:color w:val="000000"/>
-            <w:sz w:val="20"/>
-            <w:szCs w:val="20"/>
-            <w:vertAlign w:val="superscript"/>
-            <w:lang w:val="en-CA"/>
-          </w:rPr>
-          <w:delText>st</w:delText>
-        </w:r>
-        <w:r>
-          <w:rPr>
-            <w:color w:val="000000"/>
-            <w:sz w:val="20"/>
-            <w:szCs w:val="20"/>
-            <w:lang w:val="en-CA"/>
-          </w:rPr>
-          <w:delText xml:space="preserve"> </w:delText>
+          <w:delText>8</w:delText>
         </w:r>
       </w:del>
+      <w:r>
+        <w:rPr>
+          <w:color w:val="000000"/>
+          <w:sz w:val="20"/>
+          <w:szCs w:val="20"/>
+          <w:vertAlign w:val="superscript"/>
+          <w:lang w:val="en-CA"/>
+        </w:rPr>
+        <w:t>th</w:t>
+      </w:r>
+      <w:r>
+        <w:rPr>
+          <w:color w:val="000000"/>
+          <w:sz w:val="20"/>
+          <w:szCs w:val="20"/>
+          <w:lang w:val="en-CA"/>
+        </w:rPr>
+        <w:t xml:space="preserve">, </w:t>
+      </w:r>
       <w:r>
         <w:rPr>
           <w:color w:val="000000"/>

</xml_diff>